<commit_message>
short essay updated, comments added
</commit_message>
<xml_diff>
--- a/Short_Essay/Short_Essay.docx
+++ b/Short_Essay/Short_Essay.docx
@@ -66,7 +66,7 @@
           <w:numId w:val="2"/>
         </w:numPr>
         <w:rPr>
-          <w:rFonts w:ascii="Trebuchet MS" w:eastAsia="SimSun" w:hAnsi="Trebuchet MS" w:cs="Segoe UI" w:hint="eastAsia"/>
+          <w:rFonts w:ascii="Trebuchet MS" w:eastAsia="SimSun" w:hAnsi="Trebuchet MS" w:cs="Segoe UI"/>
           <w:color w:val="0F1115"/>
           <w:kern w:val="0"/>
           <w:sz w:val="28"/>
@@ -122,7 +122,7 @@
           <w:numId w:val="2"/>
         </w:numPr>
         <w:rPr>
-          <w:rFonts w:ascii="Trebuchet MS" w:eastAsia="SimSun" w:hAnsi="Trebuchet MS" w:cs="Segoe UI" w:hint="eastAsia"/>
+          <w:rFonts w:ascii="Trebuchet MS" w:eastAsia="SimSun" w:hAnsi="Trebuchet MS" w:cs="Segoe UI"/>
           <w:color w:val="0F1115"/>
           <w:kern w:val="0"/>
           <w:sz w:val="28"/>
@@ -453,43 +453,7 @@
           <w:sz w:val="28"/>
           <w:szCs w:val="28"/>
         </w:rPr>
-        <w:t xml:space="preserve">The </w:t>
-      </w:r>
-      <w:proofErr w:type="spellStart"/>
-      <w:r>
-        <w:rPr>
-          <w:rFonts w:ascii="Trebuchet MS" w:hAnsi="Trebuchet MS"/>
-          <w:sz w:val="28"/>
-          <w:szCs w:val="28"/>
-        </w:rPr>
-        <w:t>Huaxia</w:t>
-      </w:r>
-      <w:proofErr w:type="spellEnd"/>
-      <w:r>
-        <w:rPr>
-          <w:rFonts w:ascii="Trebuchet MS" w:hAnsi="Trebuchet MS"/>
-          <w:sz w:val="28"/>
-          <w:szCs w:val="28"/>
-        </w:rPr>
-        <w:t xml:space="preserve"> group categorized surrounding non-</w:t>
-      </w:r>
-      <w:proofErr w:type="spellStart"/>
-      <w:r>
-        <w:rPr>
-          <w:rFonts w:ascii="Trebuchet MS" w:hAnsi="Trebuchet MS"/>
-          <w:sz w:val="28"/>
-          <w:szCs w:val="28"/>
-        </w:rPr>
-        <w:t>Huaxia</w:t>
-      </w:r>
-      <w:proofErr w:type="spellEnd"/>
-      <w:r>
-        <w:rPr>
-          <w:rFonts w:ascii="Trebuchet MS" w:hAnsi="Trebuchet MS"/>
-          <w:sz w:val="28"/>
-          <w:szCs w:val="28"/>
-        </w:rPr>
-        <w:t xml:space="preserve"> peoples as the </w:t>
+        <w:t>The Huaxia group categorized surrounding non-Huaxia peoples as the </w:t>
       </w:r>
       <w:r>
         <w:rPr>
@@ -678,7 +642,6 @@
         </w:rPr>
         <w:t>). Foreign rulers were expected to recognize Chinese superiority through the </w:t>
       </w:r>
-      <w:proofErr w:type="spellStart"/>
       <w:r>
         <w:rPr>
           <w:rFonts w:ascii="Trebuchet MS" w:hAnsi="Trebuchet MS"/>
@@ -689,7 +652,6 @@
         </w:rPr>
         <w:t>ke-tou</w:t>
       </w:r>
-      <w:proofErr w:type="spellEnd"/>
       <w:r>
         <w:rPr>
           <w:rFonts w:ascii="Trebuchet MS" w:hAnsi="Trebuchet MS"/>
@@ -920,25 +882,7 @@
           <w:sz w:val="28"/>
           <w:szCs w:val="28"/>
         </w:rPr>
-        <w:t>Non-Han dynasties that ruled over Han Chinese include the Northern Wei (Topa), Liao (</w:t>
-      </w:r>
-      <w:proofErr w:type="spellStart"/>
-      <w:r>
-        <w:rPr>
-          <w:rFonts w:ascii="Trebuchet MS" w:hAnsi="Trebuchet MS"/>
-          <w:sz w:val="28"/>
-          <w:szCs w:val="28"/>
-        </w:rPr>
-        <w:t>Khitan</w:t>
-      </w:r>
-      <w:proofErr w:type="spellEnd"/>
-      <w:r>
-        <w:rPr>
-          <w:rFonts w:ascii="Trebuchet MS" w:hAnsi="Trebuchet MS"/>
-          <w:sz w:val="28"/>
-          <w:szCs w:val="28"/>
-        </w:rPr>
-        <w:t>), Jin (Jurchen), Yuan (Mongol), and Qing (Manchu). (Source: HUMA2635_2.pdf, p.13)</w:t>
+        <w:t>Non-Han dynasties that ruled over Han Chinese include the Northern Wei (Topa), Liao (Khitan), Jin (Jurchen), Yuan (Mongol), and Qing (Manchu). (Source: HUMA2635_2.pdf, p.13)</w:t>
       </w:r>
     </w:p>
     <w:p>
@@ -1024,29 +968,7 @@
           <w:sz w:val="28"/>
           <w:szCs w:val="28"/>
         </w:rPr>
-        <w:t>"cooked" (</w:t>
-      </w:r>
-      <w:proofErr w:type="spellStart"/>
-      <w:r>
-        <w:rPr>
-          <w:rFonts w:ascii="Trebuchet MS" w:hAnsi="Trebuchet MS"/>
-          <w:b/>
-          <w:bCs/>
-          <w:sz w:val="28"/>
-          <w:szCs w:val="28"/>
-        </w:rPr>
-        <w:t>shu</w:t>
-      </w:r>
-      <w:proofErr w:type="spellEnd"/>
-      <w:r>
-        <w:rPr>
-          <w:rFonts w:ascii="Trebuchet MS" w:hAnsi="Trebuchet MS"/>
-          <w:b/>
-          <w:bCs/>
-          <w:sz w:val="28"/>
-          <w:szCs w:val="28"/>
-        </w:rPr>
-        <w:t>, ripe</w:t>
+        <w:t>"cooked" (shu, ripe</w:t>
       </w:r>
       <w:r>
         <w:rPr>
@@ -1257,25 +1179,7 @@
           <w:sz w:val="28"/>
           <w:szCs w:val="28"/>
         </w:rPr>
-        <w:t>: both "we" (Han/min) and "they" (</w:t>
-      </w:r>
-      <w:proofErr w:type="spellStart"/>
-      <w:r>
-        <w:rPr>
-          <w:rFonts w:ascii="Trebuchet MS" w:hAnsi="Trebuchet MS"/>
-          <w:sz w:val="28"/>
-          <w:szCs w:val="28"/>
-        </w:rPr>
-        <w:t>yi</w:t>
-      </w:r>
-      <w:proofErr w:type="spellEnd"/>
-      <w:r>
-        <w:rPr>
-          <w:rFonts w:ascii="Trebuchet MS" w:hAnsi="Trebuchet MS"/>
-          <w:sz w:val="28"/>
-          <w:szCs w:val="28"/>
-        </w:rPr>
-        <w:t>/man) evolved; the standards of sinification—Chinese script, household registration, civil examinations, ancestral sacrifice—themselves changed over time. This is </w:t>
+        <w:t>: both "we" (Han/min) and "they" (yi/man) evolved; the standards of sinification—Chinese script, household registration, civil examinations, ancestral sacrifice—themselves changed over time. This is </w:t>
       </w:r>
       <w:r>
         <w:rPr>
@@ -1533,43 +1437,7 @@
           <w:sz w:val="28"/>
           <w:szCs w:val="28"/>
         </w:rPr>
-        <w:t xml:space="preserve">Culturalism, as presented in the course, refers to the dominant political community model in imperial China. It was based not on race or ethnicity but on shared cultural values and Confucian doctrines. According to the lecture slides, through education and imitation, even "barbarians" could become members of this community, thereby distinguishing themselves from others who did not share those values (HUMA2635_5, p.3). The </w:t>
-      </w:r>
-      <w:proofErr w:type="spellStart"/>
-      <w:r>
-        <w:rPr>
-          <w:rFonts w:ascii="Trebuchet MS" w:hAnsi="Trebuchet MS"/>
-          <w:sz w:val="28"/>
-          <w:szCs w:val="28"/>
-        </w:rPr>
-        <w:t>Huaxia</w:t>
-      </w:r>
-      <w:proofErr w:type="spellEnd"/>
-      <w:r>
-        <w:rPr>
-          <w:rFonts w:ascii="Trebuchet MS" w:hAnsi="Trebuchet MS"/>
-          <w:sz w:val="28"/>
-          <w:szCs w:val="28"/>
-        </w:rPr>
-        <w:t xml:space="preserve"> people classified surrounding non-</w:t>
-      </w:r>
-      <w:proofErr w:type="spellStart"/>
-      <w:r>
-        <w:rPr>
-          <w:rFonts w:ascii="Trebuchet MS" w:hAnsi="Trebuchet MS"/>
-          <w:sz w:val="28"/>
-          <w:szCs w:val="28"/>
-        </w:rPr>
-        <w:t>Huaxia</w:t>
-      </w:r>
-      <w:proofErr w:type="spellEnd"/>
-      <w:r>
-        <w:rPr>
-          <w:rFonts w:ascii="Trebuchet MS" w:hAnsi="Trebuchet MS"/>
-          <w:sz w:val="28"/>
-          <w:szCs w:val="28"/>
-        </w:rPr>
-        <w:t xml:space="preserve"> groups as the four barbarians: eastern Yi, western Rong, northern Di, and southern Man (HUMA2635_2, p.3). This culture-based identity contrasted sharply with an exclusive ethnic identity defined by Han self-description.</w:t>
+        <w:t>Culturalism, as presented in the course, refers to the dominant political community model in imperial China. It was based not on race or ethnicity but on shared cultural values and Confucian doctrines. According to the lecture slides, through education and imitation, even "barbarians" could become members of this community, thereby distinguishing themselves from others who did not share those values (HUMA2635_5, p.3). The Huaxia people classified surrounding non-Huaxia groups as the four barbarians: eastern Yi, western Rong, northern Di, and southern Man (HUMA2635_2, p.3). This culture-based identity contrasted sharply with an exclusive ethnic identity defined by Han self-description.</w:t>
       </w:r>
     </w:p>
     <w:p>
@@ -1619,25 +1487,7 @@
           <w:sz w:val="28"/>
           <w:szCs w:val="28"/>
         </w:rPr>
-        <w:t xml:space="preserve"> ruled over Han populations. Institutionally, the Tusi (native chieftain) system, established since the Yuan dynasty, incorporated local leaders into the imperial hierarchy and categorized groups as "cooked" (ripe) if integrated, or "raw" if they remained outside (HUMA2635_2, p.23). Where sinification had advanced sufficiently, the Ming and Qing governments implemented Gaitu guiliu, replacing native chieftains with regular bureaucratic administration (HUMA2635_2, p.24). The Nanzhao and Dali kingdoms illustrate cultural sinification: Nanzhao princes studied in Tang </w:t>
-      </w:r>
-      <w:proofErr w:type="spellStart"/>
-      <w:r>
-        <w:rPr>
-          <w:rFonts w:ascii="Trebuchet MS" w:hAnsi="Trebuchet MS"/>
-          <w:sz w:val="28"/>
-          <w:szCs w:val="28"/>
-        </w:rPr>
-        <w:t>Chang’an</w:t>
-      </w:r>
-      <w:proofErr w:type="spellEnd"/>
-      <w:r>
-        <w:rPr>
-          <w:rFonts w:ascii="Trebuchet MS" w:hAnsi="Trebuchet MS"/>
-          <w:sz w:val="28"/>
-          <w:szCs w:val="28"/>
-        </w:rPr>
-        <w:t>, and captured artisans were brought to the capital, while ten of the twenty-two Dali kings abdicated to become Buddhist monks.</w:t>
+        <w:t xml:space="preserve"> ruled over Han populations. Institutionally, the Tusi (native chieftain) system, established since the Yuan dynasty, incorporated local leaders into the imperial hierarchy and categorized groups as "cooked" (ripe) if integrated, or "raw" if they remained outside (HUMA2635_2, p.23). Where sinification had advanced sufficiently, the Ming and Qing governments implemented Gaitu guiliu, replacing native chieftains with regular bureaucratic administration (HUMA2635_2, p.24). The Nanzhao and Dali kingdoms illustrate cultural sinification: Nanzhao princes studied in Tang Chang’an, and captured artisans were brought to the capital, while ten of the twenty-two Dali kings abdicated to become Buddhist monks.</w:t>
       </w:r>
     </w:p>
     <w:p>
@@ -1663,34 +1513,33 @@
           <w:szCs w:val="28"/>
         </w:rPr>
         <w:lastRenderedPageBreak/>
-        <w:t xml:space="preserve">as the very criteria of sinification changed over time (HUMA2635_4, p.12). Furthermore, "majorities </w:t>
-      </w:r>
-      <w:proofErr w:type="spellStart"/>
-      <w:r>
-        <w:rPr>
-          <w:rFonts w:ascii="Trebuchet MS" w:hAnsi="Trebuchet MS"/>
-          <w:sz w:val="28"/>
-          <w:szCs w:val="28"/>
-        </w:rPr>
-        <w:t>are</w:t>
-      </w:r>
-      <w:r>
-        <w:rPr>
-          <w:rFonts w:ascii="Trebuchet MS" w:hAnsi="Trebuchet MS"/>
-          <w:sz w:val="28"/>
-          <w:szCs w:val="28"/>
-        </w:rPr>
-        <w:t>minorities</w:t>
-      </w:r>
-      <w:r>
-        <w:rPr>
-          <w:rFonts w:ascii="Trebuchet MS" w:hAnsi="Trebuchet MS"/>
-          <w:sz w:val="28"/>
-          <w:szCs w:val="28"/>
-        </w:rPr>
-        <w:t>ot</w:t>
-      </w:r>
-      <w:proofErr w:type="spellEnd"/>
+        <w:t>as the very criteria of sinification changed over time (HUMA2635_4, p.12). Furthermore, "</w:t>
+      </w:r>
+      <w:r>
+        <w:rPr>
+          <w:rFonts w:ascii="Trebuchet MS" w:hAnsi="Trebuchet MS"/>
+          <w:sz w:val="28"/>
+          <w:szCs w:val="28"/>
+        </w:rPr>
+        <w:t>Majorities are made, not born</w:t>
+      </w:r>
+    </w:p>
+    <w:p>
+      <w:pPr>
+        <w:rPr>
+          <w:rFonts w:ascii="Trebuchet MS" w:hAnsi="Trebuchet MS"/>
+          <w:sz w:val="28"/>
+          <w:szCs w:val="28"/>
+        </w:rPr>
+      </w:pPr>
+      <w:r>
+        <w:rPr>
+          <w:rFonts w:ascii="Trebuchet MS" w:hAnsi="Trebuchet MS"/>
+          <w:sz w:val="28"/>
+          <w:szCs w:val="28"/>
+        </w:rPr>
+        <w:t>”</w:t>
+      </w:r>
       <w:r>
         <w:rPr>
           <w:rFonts w:ascii="Trebuchet MS" w:hAnsi="Trebuchet MS"/>
@@ -1699,21 +1548,23 @@
         </w:rPr>
         <w:t xml:space="preserve"> </w:t>
       </w:r>
-      <w:r>
-        <w:rPr>
-          <w:rFonts w:ascii="Trebuchet MS" w:hAnsi="Trebuchet MS"/>
-          <w:sz w:val="28"/>
-          <w:szCs w:val="28"/>
-        </w:rPr>
-        <w:t>born”</w:t>
-      </w:r>
-      <w:r>
-        <w:rPr>
-          <w:rFonts w:ascii="Trebuchet MS" w:hAnsi="Trebuchet MS"/>
-          <w:sz w:val="28"/>
-          <w:szCs w:val="28"/>
-        </w:rPr>
-        <w:t xml:space="preserve"> the demarcation between Han and minority has been a continuous act of boundary-making from imperial times to the present (HUMA2635_2, p.29). Thus, culturalism and sinification together shaped the dynamic, multi-layered process of identity formation that underlies China's long-term cultural and political integration.</w:t>
+      <w:proofErr w:type="gramStart"/>
+      <w:r>
+        <w:rPr>
+          <w:rFonts w:ascii="Trebuchet MS" w:hAnsi="Trebuchet MS"/>
+          <w:sz w:val="28"/>
+          <w:szCs w:val="28"/>
+        </w:rPr>
+        <w:t>the</w:t>
+      </w:r>
+      <w:proofErr w:type="gramEnd"/>
+      <w:r>
+        <w:rPr>
+          <w:rFonts w:ascii="Trebuchet MS" w:hAnsi="Trebuchet MS"/>
+          <w:sz w:val="28"/>
+          <w:szCs w:val="28"/>
+        </w:rPr>
+        <w:t xml:space="preserve"> demarcation between Han and minority has been a continuous act of boundary-making from imperial times to the present (HUMA2635_2, p.29). Thus, culturalism and sinification together shaped the dynamic, multi-layered process of identity formation that underlies China's long-term cultural and political integration.</w:t>
       </w:r>
     </w:p>
     <w:p>
@@ -2029,7 +1880,7 @@
     <w:p>
       <w:pPr>
         <w:rPr>
-          <w:rFonts w:ascii="Trebuchet MS" w:hAnsi="Trebuchet MS" w:hint="eastAsia"/>
+          <w:rFonts w:ascii="Trebuchet MS" w:hAnsi="Trebuchet MS"/>
           <w:b/>
           <w:bCs/>
           <w:i/>
@@ -2048,7 +1899,6 @@
           <w:sz w:val="28"/>
           <w:szCs w:val="28"/>
         </w:rPr>
-        <w:lastRenderedPageBreak/>
         <w:t>分段：</w:t>
       </w:r>
     </w:p>
@@ -2185,7 +2035,6 @@
         </w:rPr>
         <w:t> — abolishing the hereditary </w:t>
       </w:r>
-      <w:proofErr w:type="spellStart"/>
       <w:r>
         <w:rPr>
           <w:rFonts w:ascii="Trebuchet MS" w:hAnsi="Trebuchet MS"/>
@@ -2196,7 +2045,6 @@
         </w:rPr>
         <w:t>tusi</w:t>
       </w:r>
-      <w:proofErr w:type="spellEnd"/>
       <w:r>
         <w:rPr>
           <w:rFonts w:ascii="Trebuchet MS" w:hAnsi="Trebuchet MS"/>
@@ -2363,7 +2211,16 @@
           <w:sz w:val="28"/>
           <w:szCs w:val="28"/>
         </w:rPr>
-        <w:t> rather than purely military conquest. (Synthesis idea)</w:t>
+        <w:t xml:space="preserve"> rather than purely military </w:t>
+      </w:r>
+      <w:r>
+        <w:rPr>
+          <w:rFonts w:ascii="Trebuchet MS" w:hAnsi="Trebuchet MS"/>
+          <w:sz w:val="28"/>
+          <w:szCs w:val="28"/>
+        </w:rPr>
+        <w:lastRenderedPageBreak/>
+        <w:t>conquest. (Synthesis idea)</w:t>
       </w:r>
     </w:p>
     <w:p>
@@ -2629,29 +2486,7 @@
           <w:sz w:val="28"/>
           <w:szCs w:val="28"/>
         </w:rPr>
-        <w:t>"cooked" (</w:t>
-      </w:r>
-      <w:proofErr w:type="spellStart"/>
-      <w:r>
-        <w:rPr>
-          <w:rFonts w:ascii="Trebuchet MS" w:hAnsi="Trebuchet MS"/>
-          <w:b/>
-          <w:bCs/>
-          <w:sz w:val="28"/>
-          <w:szCs w:val="28"/>
-        </w:rPr>
-        <w:t>shu</w:t>
-      </w:r>
-      <w:proofErr w:type="spellEnd"/>
-      <w:r>
-        <w:rPr>
-          <w:rFonts w:ascii="Trebuchet MS" w:hAnsi="Trebuchet MS"/>
-          <w:b/>
-          <w:bCs/>
-          <w:sz w:val="28"/>
-          <w:szCs w:val="28"/>
-        </w:rPr>
-        <w:t>, ripe)</w:t>
+        <w:t>"cooked" (shu, ripe)</w:t>
       </w:r>
       <w:r>
         <w:rPr>
@@ -2756,7 +2591,16 @@
           <w:sz w:val="28"/>
           <w:szCs w:val="28"/>
         </w:rPr>
-        <w:t> by increasing their numbers, thereby reducing the size of the territory each controlled. (Source: HUMA2635_2.pdf, p.24)</w:t>
+        <w:t xml:space="preserve"> by increasing their numbers, thereby reducing the size of the territory each controlled. </w:t>
+      </w:r>
+      <w:r>
+        <w:rPr>
+          <w:rFonts w:ascii="Trebuchet MS" w:hAnsi="Trebuchet MS"/>
+          <w:sz w:val="28"/>
+          <w:szCs w:val="28"/>
+        </w:rPr>
+        <w:lastRenderedPageBreak/>
+        <w:t>(Source: HUMA2635_2.pdf, p.24)</w:t>
       </w:r>
     </w:p>
     <w:p>
@@ -2777,7 +2621,6 @@
           <w:sz w:val="28"/>
           <w:szCs w:val="28"/>
         </w:rPr>
-        <w:lastRenderedPageBreak/>
         <w:t>This fragmentation strategy was a precursor</w:t>
       </w:r>
       <w:r>
@@ -3050,7 +2893,7 @@
           <w:sz w:val="28"/>
           <w:szCs w:val="28"/>
         </w:rPr>
-        <w:t xml:space="preserve">later became the territorial basis for modern nation-state claims. (Source: HUMA2635_3.pdf, </w:t>
+        <w:t xml:space="preserve">later became the territorial basis for </w:t>
       </w:r>
       <w:r>
         <w:rPr>
@@ -3059,7 +2902,7 @@
           <w:szCs w:val="28"/>
         </w:rPr>
         <w:lastRenderedPageBreak/>
-        <w:t>pp.3-4; synthesis idea)</w:t>
+        <w:t>modern nation-state claims. (Source: HUMA2635_3.pdf, pp.3-4; synthesis idea)</w:t>
       </w:r>
     </w:p>
     <w:p>
@@ -3120,6 +2963,168 @@
         </w:rPr>
         <w:t>, aiming at control rather than deep cultural assimilation in the short term. (Source: HUMA2635_2.pdf, p.26)</w:t>
       </w:r>
+    </w:p>
+    <w:p>
+      <w:pPr>
+        <w:rPr>
+          <w:rFonts w:ascii="Trebuchet MS" w:hAnsi="Trebuchet MS"/>
+          <w:sz w:val="28"/>
+          <w:szCs w:val="28"/>
+        </w:rPr>
+      </w:pPr>
+    </w:p>
+    <w:p>
+      <w:pPr>
+        <w:rPr>
+          <w:rFonts w:ascii="Trebuchet MS" w:hAnsi="Trebuchet MS"/>
+          <w:sz w:val="28"/>
+          <w:szCs w:val="28"/>
+        </w:rPr>
+      </w:pPr>
+      <w:r>
+        <w:rPr>
+          <w:rFonts w:ascii="Trebuchet MS" w:hAnsi="Trebuchet MS" w:hint="eastAsia"/>
+          <w:sz w:val="28"/>
+          <w:szCs w:val="28"/>
+        </w:rPr>
+        <w:t>EXAMPLE:</w:t>
+      </w:r>
+    </w:p>
+    <w:p>
+      <w:pPr>
+        <w:rPr>
+          <w:rFonts w:ascii="Trebuchet MS" w:hAnsi="Trebuchet MS"/>
+          <w:sz w:val="28"/>
+          <w:szCs w:val="28"/>
+        </w:rPr>
+      </w:pPr>
+      <w:r>
+        <w:rPr>
+          <w:rFonts w:ascii="Trebuchet MS" w:hAnsi="Trebuchet MS"/>
+          <w:sz w:val="28"/>
+          <w:szCs w:val="28"/>
+        </w:rPr>
+        <w:t>Gaitu guiliu (</w:t>
+      </w:r>
+      <w:r>
+        <w:rPr>
+          <w:rFonts w:ascii="Trebuchet MS" w:hAnsi="Trebuchet MS"/>
+          <w:sz w:val="28"/>
+          <w:szCs w:val="28"/>
+        </w:rPr>
+        <w:t>改土歸流</w:t>
+      </w:r>
+      <w:r>
+        <w:rPr>
+          <w:rFonts w:ascii="Trebuchet MS" w:hAnsi="Trebuchet MS"/>
+          <w:sz w:val="28"/>
+          <w:szCs w:val="28"/>
+        </w:rPr>
+        <w:t>) was a major administrative reform policy in late imperial China, implemented primarily during the Ming and Qing dynasties. The term literally means "replacing native with regular," referring to the abolition of hereditary native chieftaincies (tusi) and their replacement by regular government officials appointed by the imperial state (HUMA2635_2, p.24).</w:t>
+      </w:r>
+    </w:p>
+    <w:p>
+      <w:pPr>
+        <w:rPr>
+          <w:rFonts w:ascii="Trebuchet MS" w:hAnsi="Trebuchet MS"/>
+          <w:sz w:val="28"/>
+          <w:szCs w:val="28"/>
+        </w:rPr>
+      </w:pPr>
+      <w:r>
+        <w:rPr>
+          <w:rFonts w:ascii="Trebuchet MS" w:hAnsi="Trebuchet MS"/>
+          <w:sz w:val="28"/>
+          <w:szCs w:val="28"/>
+        </w:rPr>
+        <w:t>To understand Gaitu guiliu, one must first examine the Tusi system it sought to replace. Since the Yuan dynasty, the imperial government had absorbed non-Han native leaders into the lower levels of the state hierarchy, granting them official titles prefixed with Tu (</w:t>
+      </w:r>
+      <w:r>
+        <w:rPr>
+          <w:rFonts w:ascii="Trebuchet MS" w:hAnsi="Trebuchet MS"/>
+          <w:sz w:val="28"/>
+          <w:szCs w:val="28"/>
+        </w:rPr>
+        <w:t>土</w:t>
+      </w:r>
+      <w:r>
+        <w:rPr>
+          <w:rFonts w:ascii="Trebuchet MS" w:hAnsi="Trebuchet MS"/>
+          <w:sz w:val="28"/>
+          <w:szCs w:val="28"/>
+        </w:rPr>
+        <w:t>, "native") and making these positions hereditary (HUMA2635_2, p.23). Ethnic groups brought under this system were called "cooked" (</w:t>
+      </w:r>
+      <w:proofErr w:type="gramStart"/>
+      <w:r>
+        <w:rPr>
+          <w:rFonts w:ascii="Trebuchet MS" w:hAnsi="Trebuchet MS"/>
+          <w:sz w:val="28"/>
+          <w:szCs w:val="28"/>
+        </w:rPr>
+        <w:t>shu) —</w:t>
+      </w:r>
+      <w:proofErr w:type="gramEnd"/>
+      <w:r>
+        <w:rPr>
+          <w:rFonts w:ascii="Trebuchet MS" w:hAnsi="Trebuchet MS"/>
+          <w:sz w:val="28"/>
+          <w:szCs w:val="28"/>
+        </w:rPr>
+        <w:t xml:space="preserve"> considered partially integrated — </w:t>
+      </w:r>
+      <w:r>
+        <w:rPr>
+          <w:rFonts w:ascii="Trebuchet MS" w:hAnsi="Trebuchet MS"/>
+          <w:sz w:val="28"/>
+          <w:szCs w:val="28"/>
+        </w:rPr>
+        <w:lastRenderedPageBreak/>
+        <w:t>while those remaining outside were called "raw" (sheng). The state also encouraged Han migration into these areas, which gradually promoted cultural assimilation. However, the Tusi system left hereditary local power intact, and over time these native chieftains could pose challenges to central authority.</w:t>
+      </w:r>
+    </w:p>
+    <w:p>
+      <w:pPr>
+        <w:rPr>
+          <w:rFonts w:ascii="Trebuchet MS" w:hAnsi="Trebuchet MS"/>
+          <w:sz w:val="28"/>
+          <w:szCs w:val="28"/>
+        </w:rPr>
+      </w:pPr>
+      <w:r>
+        <w:rPr>
+          <w:rFonts w:ascii="Trebuchet MS" w:hAnsi="Trebuchet MS"/>
+          <w:sz w:val="28"/>
+          <w:szCs w:val="28"/>
+        </w:rPr>
+        <w:t>The Gaitu guiliu policy was therefore introduced to resolve this tension. According to the course materials, where progressive sinification of minority peoples had made native officials unnecessary, the Ming and Qing courts implemented direct bureaucratic rule (HUMA2635_2, p.24). In other areas, authorities weakened native power by increasing the number of chieftains, thereby reducing each one's territorial control. This reform was not applied everywhere at once but selectively and incrementally, reflecting a pragmatic approach to state-building on the empire's frontiers.</w:t>
+      </w:r>
+    </w:p>
+    <w:p>
+      <w:pPr>
+        <w:rPr>
+          <w:rFonts w:ascii="Trebuchet MS" w:hAnsi="Trebuchet MS"/>
+          <w:sz w:val="28"/>
+          <w:szCs w:val="28"/>
+        </w:rPr>
+      </w:pPr>
+      <w:r>
+        <w:rPr>
+          <w:rFonts w:ascii="Trebuchet MS" w:hAnsi="Trebuchet MS"/>
+          <w:sz w:val="28"/>
+          <w:szCs w:val="28"/>
+        </w:rPr>
+        <w:t>In conclusion, Gaitu guiliu was a pivotal policy in the long process of incorporating southwestern minority territories into the regular Chinese administrative system. It moved frontier regions from indirect rule through native intermediaries toward direct imperial governance, laying the groundwork for the territorial integration that would later define the modern Chinese state.</w:t>
+      </w:r>
+    </w:p>
+    <w:p>
+      <w:pPr>
+        <w:rPr>
+          <w:rFonts w:ascii="Trebuchet MS" w:hAnsi="Trebuchet MS" w:hint="eastAsia"/>
+          <w:sz w:val="28"/>
+          <w:szCs w:val="28"/>
+        </w:rPr>
+      </w:pPr>
     </w:p>
     <w:p>
       <w:pPr>
@@ -3220,15 +3225,7 @@
           <w:sz w:val="28"/>
           <w:szCs w:val="28"/>
         </w:rPr>
-        <w:t>Introducing</w:t>
-      </w:r>
-      <w:r>
-        <w:rPr>
-          <w:rFonts w:ascii="Trebuchet MS" w:hAnsi="Trebuchet MS"/>
-          <w:sz w:val="28"/>
-          <w:szCs w:val="28"/>
-        </w:rPr>
-        <w:t xml:space="preserve"> the Sinicization</w:t>
+        <w:t>Introducing the Sinicization</w:t>
       </w:r>
       <w:r>
         <w:rPr>
@@ -3291,15 +3288,7 @@
           <w:sz w:val="28"/>
           <w:szCs w:val="28"/>
         </w:rPr>
-        <w:t xml:space="preserve">Present New Qing History's </w:t>
-      </w:r>
-      <w:r>
-        <w:rPr>
-          <w:rFonts w:ascii="Trebuchet MS" w:hAnsi="Trebuchet MS"/>
-          <w:sz w:val="28"/>
-          <w:szCs w:val="28"/>
-        </w:rPr>
-        <w:t>counter</w:t>
+        <w:t>Present New Qing History's counter</w:t>
       </w:r>
       <w:r>
         <w:rPr>
@@ -3560,7 +3549,7 @@
     <w:p>
       <w:pPr>
         <w:rPr>
-          <w:rFonts w:ascii="Trebuchet MS" w:hAnsi="Trebuchet MS" w:hint="eastAsia"/>
+          <w:rFonts w:ascii="Trebuchet MS" w:hAnsi="Trebuchet MS"/>
           <w:b/>
           <w:bCs/>
           <w:i/>
@@ -3579,7 +3568,6 @@
           <w:sz w:val="28"/>
           <w:szCs w:val="28"/>
         </w:rPr>
-        <w:lastRenderedPageBreak/>
         <w:t>分段：</w:t>
       </w:r>
     </w:p>
@@ -3662,7 +3650,16 @@
           <w:sz w:val="28"/>
           <w:szCs w:val="28"/>
         </w:rPr>
-        <w:t> from Han to Tang, Song, Yuan, and Qing. Non-Han groups who invaded the central plain gained governance legitimacy only </w:t>
+        <w:t> from Han to Tang, Song, Yuan, and Qing. Non-</w:t>
+      </w:r>
+      <w:r>
+        <w:rPr>
+          <w:rFonts w:ascii="Trebuchet MS" w:hAnsi="Trebuchet MS"/>
+          <w:sz w:val="28"/>
+          <w:szCs w:val="28"/>
+        </w:rPr>
+        <w:lastRenderedPageBreak/>
+        <w:t>Han groups who invaded the central plain gained governance legitimacy only </w:t>
       </w:r>
       <w:r>
         <w:rPr>
@@ -3828,40 +3825,7 @@
           <w:sz w:val="28"/>
           <w:szCs w:val="28"/>
         </w:rPr>
-        <w:t>Ping-</w:t>
-      </w:r>
-      <w:proofErr w:type="spellStart"/>
-      <w:r>
-        <w:rPr>
-          <w:rFonts w:ascii="Trebuchet MS" w:hAnsi="Trebuchet MS"/>
-          <w:b/>
-          <w:bCs/>
-          <w:sz w:val="28"/>
-          <w:szCs w:val="28"/>
-        </w:rPr>
-        <w:t>ti</w:t>
-      </w:r>
-      <w:proofErr w:type="spellEnd"/>
-      <w:r>
-        <w:rPr>
-          <w:rFonts w:ascii="Trebuchet MS" w:hAnsi="Trebuchet MS"/>
-          <w:b/>
-          <w:bCs/>
-          <w:sz w:val="28"/>
-          <w:szCs w:val="28"/>
-        </w:rPr>
-        <w:t xml:space="preserve"> </w:t>
-      </w:r>
-      <w:r>
-        <w:rPr>
-          <w:rFonts w:ascii="Trebuchet MS" w:hAnsi="Trebuchet MS"/>
-          <w:b/>
-          <w:bCs/>
-          <w:sz w:val="28"/>
-          <w:szCs w:val="28"/>
-        </w:rPr>
-        <w:lastRenderedPageBreak/>
-        <w:t>Ho</w:t>
+        <w:t>Ping-ti Ho</w:t>
       </w:r>
       <w:r>
         <w:rPr>
@@ -4151,7 +4115,6 @@
           <w:sz w:val="28"/>
           <w:szCs w:val="28"/>
         </w:rPr>
-        <w:lastRenderedPageBreak/>
         <w:t>Bonus Points</w:t>
       </w:r>
     </w:p>
@@ -4182,18 +4145,8 @@
           <w:sz w:val="28"/>
           <w:szCs w:val="28"/>
         </w:rPr>
-        <w:t xml:space="preserve">James </w:t>
-      </w:r>
-      <w:proofErr w:type="spellStart"/>
-      <w:r>
-        <w:rPr>
-          <w:rFonts w:ascii="Trebuchet MS" w:hAnsi="Trebuchet MS"/>
-          <w:sz w:val="28"/>
-          <w:szCs w:val="28"/>
-        </w:rPr>
-        <w:t>Millward</w:t>
-      </w:r>
-      <w:proofErr w:type="spellEnd"/>
+        <w:t>James Millward</w:t>
+      </w:r>
       <w:r>
         <w:rPr>
           <w:rFonts w:ascii="Trebuchet MS" w:hAnsi="Trebuchet MS" w:hint="eastAsia"/>
@@ -4314,29 +4267,7 @@
           <w:sz w:val="28"/>
           <w:szCs w:val="28"/>
         </w:rPr>
-        <w:t xml:space="preserve">Chengde (Bishu </w:t>
-      </w:r>
-      <w:proofErr w:type="spellStart"/>
-      <w:r>
-        <w:rPr>
-          <w:rFonts w:ascii="Trebuchet MS" w:hAnsi="Trebuchet MS"/>
-          <w:b/>
-          <w:bCs/>
-          <w:sz w:val="28"/>
-          <w:szCs w:val="28"/>
-        </w:rPr>
-        <w:t>Shanzhuang</w:t>
-      </w:r>
-      <w:proofErr w:type="spellEnd"/>
-      <w:r>
-        <w:rPr>
-          <w:rFonts w:ascii="Trebuchet MS" w:hAnsi="Trebuchet MS"/>
-          <w:b/>
-          <w:bCs/>
-          <w:sz w:val="28"/>
-          <w:szCs w:val="28"/>
-        </w:rPr>
-        <w:t>)</w:t>
+        <w:t>Chengde (Bishu Shanzhuang)</w:t>
       </w:r>
       <w:r>
         <w:rPr>
@@ -4418,6 +4349,7 @@
           <w:sz w:val="28"/>
           <w:szCs w:val="28"/>
         </w:rPr>
+        <w:lastRenderedPageBreak/>
         <w:t> </w:t>
       </w:r>
       <w:r>
@@ -4434,15 +4366,7 @@
           <w:sz w:val="28"/>
           <w:szCs w:val="28"/>
         </w:rPr>
-        <w:t>ultural legitimacy theory</w:t>
-      </w:r>
-      <w:r>
-        <w:rPr>
-          <w:rFonts w:ascii="Trebuchet MS" w:hAnsi="Trebuchet MS"/>
-          <w:sz w:val="28"/>
-          <w:szCs w:val="28"/>
-        </w:rPr>
-        <w:t xml:space="preserve"> </w:t>
+        <w:t xml:space="preserve">ultural legitimacy theory </w:t>
       </w:r>
       <w:r>
         <w:rPr>
@@ -4546,16 +4470,7 @@
           <w:sz w:val="28"/>
           <w:szCs w:val="28"/>
         </w:rPr>
-        <w:t xml:space="preserve">: the standards of being </w:t>
-      </w:r>
-      <w:r>
-        <w:rPr>
-          <w:rFonts w:ascii="Trebuchet MS" w:hAnsi="Trebuchet MS"/>
-          <w:sz w:val="28"/>
-          <w:szCs w:val="28"/>
-        </w:rPr>
-        <w:lastRenderedPageBreak/>
-        <w:t>"Chinese" — Chinese script</w:t>
+        <w:t>: the standards of being "Chinese" — Chinese script</w:t>
       </w:r>
       <w:r>
         <w:rPr>
@@ -4849,7 +4764,16 @@
           <w:sz w:val="28"/>
           <w:szCs w:val="28"/>
         </w:rPr>
-        <w:t xml:space="preserve"> a way to explain Chinese political and cultural unification through the perspective of a legitimizing process over varied geographic regions. (Source: HUMA2635_4.pdf, p.15)</w:t>
+        <w:t xml:space="preserve"> a way to explain Chinese political and cultural unification through the </w:t>
+      </w:r>
+      <w:r>
+        <w:rPr>
+          <w:rFonts w:ascii="Trebuchet MS" w:hAnsi="Trebuchet MS"/>
+          <w:sz w:val="28"/>
+          <w:szCs w:val="28"/>
+        </w:rPr>
+        <w:lastRenderedPageBreak/>
+        <w:t>perspective of a legitimizing process over varied geographic regions. (Source: HUMA2635_4.pdf, p.15)</w:t>
       </w:r>
     </w:p>
     <w:p>
@@ -4899,7 +4823,75 @@
           <w:sz w:val="28"/>
           <w:szCs w:val="28"/>
         </w:rPr>
-        <w:t xml:space="preserve"> participated in negotiating cultural </w:t>
+        <w:t> participated in negotiating cultural identity, rather than one simply absorbing the other. The history of China and the history of the parts are equally important as the history of the whole. (Source: HUMA2635_4.pdf, p.15)</w:t>
+      </w:r>
+    </w:p>
+    <w:p>
+      <w:pPr>
+        <w:jc w:val="left"/>
+        <w:rPr>
+          <w:rFonts w:ascii="Trebuchet MS" w:hAnsi="Trebuchet MS"/>
+          <w:sz w:val="28"/>
+          <w:szCs w:val="28"/>
+        </w:rPr>
+      </w:pPr>
+    </w:p>
+    <w:p>
+      <w:pPr>
+        <w:jc w:val="left"/>
+        <w:rPr>
+          <w:rFonts w:ascii="Trebuchet MS" w:hAnsi="Trebuchet MS"/>
+          <w:b/>
+          <w:bCs/>
+          <w:sz w:val="28"/>
+          <w:szCs w:val="28"/>
+        </w:rPr>
+      </w:pPr>
+      <w:r>
+        <w:rPr>
+          <w:rFonts w:ascii="Trebuchet MS" w:hAnsi="Trebuchet MS" w:hint="eastAsia"/>
+          <w:b/>
+          <w:bCs/>
+          <w:sz w:val="28"/>
+          <w:szCs w:val="28"/>
+        </w:rPr>
+        <w:t xml:space="preserve">EXAMPLE: </w:t>
+      </w:r>
+    </w:p>
+    <w:p>
+      <w:pPr>
+        <w:jc w:val="left"/>
+        <w:rPr>
+          <w:rFonts w:ascii="Trebuchet MS" w:hAnsi="Trebuchet MS"/>
+          <w:sz w:val="28"/>
+          <w:szCs w:val="28"/>
+        </w:rPr>
+      </w:pPr>
+      <w:r>
+        <w:rPr>
+          <w:rFonts w:ascii="Trebuchet MS" w:hAnsi="Trebuchet MS"/>
+          <w:sz w:val="28"/>
+          <w:szCs w:val="28"/>
+        </w:rPr>
+        <w:t>The debate over late imperial Chinese history centers on two competing frameworks: Sinicization and New Qing History. The Sinicization thesis interprets Chinese history as a continuous narrative of dynastic replacement, arguing that non-Han conquerors gained legitimacy by being educated in Confucianism and assimilating into Han culture (HUMA2635_4, p.2). From this perspective, the Qing dynasty's success stemmed from its adoption of Chinese cultural and political norms.</w:t>
+      </w:r>
+    </w:p>
+    <w:p>
+      <w:pPr>
+        <w:jc w:val="left"/>
+        <w:rPr>
+          <w:rFonts w:ascii="Trebuchet MS" w:hAnsi="Trebuchet MS"/>
+          <w:sz w:val="28"/>
+          <w:szCs w:val="28"/>
+        </w:rPr>
+      </w:pPr>
+      <w:r>
+        <w:rPr>
+          <w:rFonts w:ascii="Trebuchet MS" w:hAnsi="Trebuchet MS"/>
+          <w:sz w:val="28"/>
+          <w:szCs w:val="28"/>
+        </w:rPr>
+        <w:t xml:space="preserve">New Qing historians fundamentally challenge this view. Scholars such as Evelyn Rawski, Mark Elliott, and James Millward separate the concept of the Qing empire from "China" proper. They argue that Manchu rulers deliberately maintained their ethnic identity </w:t>
       </w:r>
       <w:r>
         <w:rPr>
@@ -4908,7 +4900,7 @@
           <w:szCs w:val="28"/>
         </w:rPr>
         <w:lastRenderedPageBreak/>
-        <w:t>identity, rather than one simply absorbing the other. The history of China and the history of the parts are equally important as the history of the whole. (Source: HUMA2635_4.pdf, p.15)</w:t>
+        <w:t>through the Eight Banner system, Manchu language, and distinct religious practices including Tibetan Buddhism and Shamanism (HUMA2635_4, p.3). Crucially, the Qing emperors performed multiple roles: Confucian monarchs for Han subjects, Khans for Mongols, and Reincarnated Buddhas for Tibetans. According to Millward's "Five Nations Under Heaven" model, Han, Manchu, Tibetan, Mongol, and Muslim peoples occupied parallel positions under Qing imperial rule, with the Chengde summer capital symbolizing this multi-ethnic integration (HUMA2635_4, pp.9-11). Thus, Inner Asia was not a peripheral frontier but a distinct component of a larger empire. This argument carries modern political implications: if the Qing was an empire distinct from China, territories like Xinjiang, Tibet, and Mongolia were not necessarily Chinese by inheritance (HUMA2635_4, p.14).</w:t>
       </w:r>
     </w:p>
     <w:p>
@@ -4920,81 +4912,31 @@
           <w:szCs w:val="28"/>
         </w:rPr>
       </w:pPr>
-    </w:p>
-    <w:p>
-      <w:pPr>
-        <w:jc w:val="left"/>
-        <w:rPr>
-          <w:rFonts w:ascii="Trebuchet MS" w:hAnsi="Trebuchet MS"/>
-          <w:b/>
-          <w:bCs/>
-          <w:sz w:val="28"/>
-          <w:szCs w:val="28"/>
-        </w:rPr>
-      </w:pPr>
-      <w:r>
-        <w:rPr>
-          <w:rFonts w:ascii="Trebuchet MS" w:hAnsi="Trebuchet MS" w:hint="eastAsia"/>
-          <w:b/>
-          <w:bCs/>
-          <w:sz w:val="28"/>
-          <w:szCs w:val="28"/>
-        </w:rPr>
-        <w:t xml:space="preserve">EXAMPLE: </w:t>
-      </w:r>
-    </w:p>
-    <w:p>
-      <w:pPr>
-        <w:jc w:val="left"/>
-        <w:rPr>
-          <w:rFonts w:ascii="Trebuchet MS" w:hAnsi="Trebuchet MS"/>
-          <w:sz w:val="28"/>
-          <w:szCs w:val="28"/>
-        </w:rPr>
-      </w:pPr>
-      <w:r>
-        <w:rPr>
-          <w:rFonts w:ascii="Trebuchet MS" w:hAnsi="Trebuchet MS"/>
-          <w:sz w:val="28"/>
-          <w:szCs w:val="28"/>
-        </w:rPr>
-        <w:t>The debate over late imperial Chinese history centers on two competing frameworks: Sinicization and New Qing History. The Sinicization thesis interprets Chinese history as a continuous narrative of dynastic replacement, arguing that non-Han conquerors gained legitimacy by being educated in Confucianism and assimilating into Han culture (HUMA2635_4, p.2). From this perspective, the Qing dynasty's success stemmed from its adoption of Chinese cultural and political norms.</w:t>
-      </w:r>
-    </w:p>
-    <w:p>
-      <w:pPr>
-        <w:jc w:val="left"/>
-        <w:rPr>
-          <w:rFonts w:ascii="Trebuchet MS" w:hAnsi="Trebuchet MS"/>
-          <w:sz w:val="28"/>
-          <w:szCs w:val="28"/>
-        </w:rPr>
-      </w:pPr>
-      <w:r>
-        <w:rPr>
-          <w:rFonts w:ascii="Trebuchet MS" w:hAnsi="Trebuchet MS"/>
-          <w:sz w:val="28"/>
-          <w:szCs w:val="28"/>
-        </w:rPr>
-        <w:t xml:space="preserve">New Qing historians fundamentally challenge this view. Scholars such as Evelyn Rawski, Mark Elliott, and James </w:t>
-      </w:r>
-      <w:proofErr w:type="spellStart"/>
-      <w:r>
-        <w:rPr>
-          <w:rFonts w:ascii="Trebuchet MS" w:hAnsi="Trebuchet MS"/>
-          <w:sz w:val="28"/>
-          <w:szCs w:val="28"/>
-        </w:rPr>
-        <w:t>Millward</w:t>
-      </w:r>
-      <w:proofErr w:type="spellEnd"/>
-      <w:r>
-        <w:rPr>
-          <w:rFonts w:ascii="Trebuchet MS" w:hAnsi="Trebuchet MS"/>
-          <w:sz w:val="28"/>
-          <w:szCs w:val="28"/>
-        </w:rPr>
-        <w:t xml:space="preserve"> separate the concept of the Qing empire from "China" proper. They argue that Manchu rulers deliberately maintained their ethnic identity through the Eight Banner system, Manchu language, and distinct religious practices including Tibetan Buddhism and Shamanism (HUMA2635_4, p.3). Crucially, the Qing emperors performed multiple roles: Confucian monarchs for Han subjects, Khans for </w:t>
+      <w:r>
+        <w:rPr>
+          <w:rFonts w:ascii="Trebuchet MS" w:hAnsi="Trebuchet MS"/>
+          <w:sz w:val="28"/>
+          <w:szCs w:val="28"/>
+        </w:rPr>
+        <w:t xml:space="preserve">As a potential resolution, David Faure offers the theory of cultural legitimacy. He argues that "min" was a legal status, and the markers of being "Chinese" — written script, household registration, civil examinations, ancestral sacrifice — were themselves evolving among both Han and non-Han populations from the fifteenth to the twentieth centuries (HUMA2635_4, p.12). The imperial state presumed greater unity than its institutions could </w:t>
+      </w:r>
+      <w:proofErr w:type="gramStart"/>
+      <w:r>
+        <w:rPr>
+          <w:rFonts w:ascii="Trebuchet MS" w:hAnsi="Trebuchet MS"/>
+          <w:sz w:val="28"/>
+          <w:szCs w:val="28"/>
+        </w:rPr>
+        <w:t>actually deliver</w:t>
+      </w:r>
+      <w:proofErr w:type="gramEnd"/>
+      <w:r>
+        <w:rPr>
+          <w:rFonts w:ascii="Trebuchet MS" w:hAnsi="Trebuchet MS"/>
+          <w:sz w:val="28"/>
+          <w:szCs w:val="28"/>
+        </w:rPr>
+        <w:t xml:space="preserve">, and local societies did not </w:t>
       </w:r>
       <w:r>
         <w:rPr>
@@ -5003,70 +4945,7 @@
           <w:szCs w:val="28"/>
         </w:rPr>
         <w:lastRenderedPageBreak/>
-        <w:t xml:space="preserve">Mongols, and Reincarnated Buddhas for Tibetans. According to </w:t>
-      </w:r>
-      <w:proofErr w:type="spellStart"/>
-      <w:r>
-        <w:rPr>
-          <w:rFonts w:ascii="Trebuchet MS" w:hAnsi="Trebuchet MS"/>
-          <w:sz w:val="28"/>
-          <w:szCs w:val="28"/>
-        </w:rPr>
-        <w:t>Millward's</w:t>
-      </w:r>
-      <w:proofErr w:type="spellEnd"/>
-      <w:r>
-        <w:rPr>
-          <w:rFonts w:ascii="Trebuchet MS" w:hAnsi="Trebuchet MS"/>
-          <w:sz w:val="28"/>
-          <w:szCs w:val="28"/>
-        </w:rPr>
-        <w:t xml:space="preserve"> "Five Nations Under Heaven" model, Han, Manchu, Tibetan, Mongol, and Muslim peoples occupied parallel positions under Qing imperial rule, with the Chengde summer capital symbolizing this multi-ethnic integration (HUMA2635_4, pp.9-11). Thus, Inner Asia was not a peripheral frontier but a distinct component of a larger empire. This argument carries modern political implications: if the Qing was an empire distinct from China, territories like Xinjiang, Tibet, and Mongolia were not necessarily Chinese by inheritance (HUMA2635_4, p.14).</w:t>
-      </w:r>
-    </w:p>
-    <w:p>
-      <w:pPr>
-        <w:jc w:val="left"/>
-        <w:rPr>
-          <w:rFonts w:ascii="Trebuchet MS" w:hAnsi="Trebuchet MS"/>
-          <w:sz w:val="28"/>
-          <w:szCs w:val="28"/>
-        </w:rPr>
-      </w:pPr>
-      <w:r>
-        <w:rPr>
-          <w:rFonts w:ascii="Trebuchet MS" w:hAnsi="Trebuchet MS"/>
-          <w:sz w:val="28"/>
-          <w:szCs w:val="28"/>
-        </w:rPr>
-        <w:t xml:space="preserve">As a potential resolution, David Faure offers the theory of cultural legitimacy. He argues that "min" was a legal status, and the markers of being "Chinese" — written script, household registration, civil examinations, ancestral sacrifice — were themselves evolving among both Han and non-Han populations from the fifteenth to the twentieth centuries (HUMA2635_4, p.12). The imperial state presumed greater unity than its institutions could </w:t>
-      </w:r>
-      <w:proofErr w:type="gramStart"/>
-      <w:r>
-        <w:rPr>
-          <w:rFonts w:ascii="Trebuchet MS" w:hAnsi="Trebuchet MS"/>
-          <w:sz w:val="28"/>
-          <w:szCs w:val="28"/>
-        </w:rPr>
-        <w:t>actually deliver</w:t>
-      </w:r>
-      <w:proofErr w:type="gramEnd"/>
-      <w:r>
-        <w:rPr>
-          <w:rFonts w:ascii="Trebuchet MS" w:hAnsi="Trebuchet MS"/>
-          <w:sz w:val="28"/>
-          <w:szCs w:val="28"/>
-        </w:rPr>
-        <w:t xml:space="preserve">, and local societies did not accept imposition without negotiation. Instead, cultural symbols were legitimized through master-disciple transmission, the authority of writing, and state recognition, producing overlapping but locally varied forms of identity across China's vast territories </w:t>
-      </w:r>
-      <w:r>
-        <w:rPr>
-          <w:rFonts w:ascii="Trebuchet MS" w:hAnsi="Trebuchet MS"/>
-          <w:sz w:val="28"/>
-          <w:szCs w:val="28"/>
-        </w:rPr>
-        <w:lastRenderedPageBreak/>
-        <w:t>(HUMA2635_4, pp.12,15). This theory thus reframes the debate: rather than asking whether the Qing were "Sinicized" or "Manchu," it examines how both center and periphery continuously negotiated cultural identity within a shared but flexible symbolic framework.</w:t>
+        <w:t>accept imposition without negotiation. Instead, cultural symbols were legitimized through master-disciple transmission, the authority of writing, and state recognition, producing overlapping but locally varied forms of identity across China's vast territories (HUMA2635_4, pp.12,15). This theory thus reframes the debate: rather than asking whether the Qing were "Sinicized" or "Manchu," it examines how both center and periphery continuously negotiated cultural identity within a shared but flexible symbolic framework.</w:t>
       </w:r>
     </w:p>
     <w:p>
@@ -5419,6 +5298,7 @@
           <w:sz w:val="28"/>
           <w:szCs w:val="28"/>
         </w:rPr>
+        <w:lastRenderedPageBreak/>
         <w:t>Explain the second metaphor (ethnic minorities as children) and its implications</w:t>
       </w:r>
       <w:r>
@@ -5451,43 +5331,7 @@
           <w:sz w:val="28"/>
           <w:szCs w:val="28"/>
         </w:rPr>
-        <w:t xml:space="preserve"> and educable; </w:t>
-      </w:r>
-      <w:proofErr w:type="spellStart"/>
-      <w:r>
-        <w:rPr>
-          <w:rFonts w:ascii="Trebuchet MS" w:hAnsi="Trebuchet MS"/>
-          <w:sz w:val="28"/>
-          <w:szCs w:val="28"/>
-        </w:rPr>
-        <w:t>xiongdi</w:t>
-      </w:r>
-      <w:proofErr w:type="spellEnd"/>
-      <w:r>
-        <w:rPr>
-          <w:rFonts w:ascii="Trebuchet MS" w:hAnsi="Trebuchet MS"/>
-          <w:sz w:val="28"/>
-          <w:szCs w:val="28"/>
-        </w:rPr>
-        <w:t xml:space="preserve"> </w:t>
-      </w:r>
-      <w:proofErr w:type="spellStart"/>
-      <w:r>
-        <w:rPr>
-          <w:rFonts w:ascii="Trebuchet MS" w:hAnsi="Trebuchet MS"/>
-          <w:sz w:val="28"/>
-          <w:szCs w:val="28"/>
-        </w:rPr>
-        <w:t>minzu</w:t>
-      </w:r>
-      <w:proofErr w:type="spellEnd"/>
-      <w:r>
-        <w:rPr>
-          <w:rFonts w:ascii="Trebuchet MS" w:hAnsi="Trebuchet MS"/>
-          <w:sz w:val="28"/>
-          <w:szCs w:val="28"/>
-        </w:rPr>
-        <w:t>; big-brother/little-brother; civilizable</w:t>
+        <w:t xml:space="preserve"> and educable; xiongdi minzu; big-brother/little-brother; civilizable</w:t>
       </w:r>
       <w:r>
         <w:rPr>
@@ -5518,7 +5362,6 @@
           <w:sz w:val="28"/>
           <w:szCs w:val="28"/>
         </w:rPr>
-        <w:lastRenderedPageBreak/>
         <w:t>Explain the third metaphor (ethnic minorities as ancient) and synthesize the relationship with civilizing centers</w:t>
       </w:r>
       <w:r>
@@ -5535,15 +5378,7 @@
           <w:sz w:val="28"/>
           <w:szCs w:val="28"/>
         </w:rPr>
-        <w:t xml:space="preserve">ancient and unchanged; historical gap; evolutionary stage; legitimation of civilizing </w:t>
-      </w:r>
-      <w:r>
-        <w:rPr>
-          <w:rFonts w:ascii="Trebuchet MS" w:hAnsi="Trebuchet MS"/>
-          <w:sz w:val="28"/>
-          <w:szCs w:val="28"/>
-        </w:rPr>
-        <w:t>tasks</w:t>
+        <w:t>ancient and unchanged; historical gap; evolutionary stage; legitimation of civilizing tasks</w:t>
       </w:r>
       <w:r>
         <w:rPr>
@@ -5557,7 +5392,7 @@
     <w:p>
       <w:pPr>
         <w:rPr>
-          <w:rFonts w:ascii="Trebuchet MS" w:hAnsi="Trebuchet MS" w:hint="eastAsia"/>
+          <w:rFonts w:ascii="Trebuchet MS" w:hAnsi="Trebuchet MS"/>
           <w:b/>
           <w:bCs/>
           <w:i/>
@@ -5822,7 +5657,16 @@
           <w:sz w:val="28"/>
           <w:szCs w:val="28"/>
         </w:rPr>
-        <w:t>, and the </w:t>
+        <w:t xml:space="preserve">, </w:t>
+      </w:r>
+      <w:r>
+        <w:rPr>
+          <w:rFonts w:ascii="Trebuchet MS" w:hAnsi="Trebuchet MS"/>
+          <w:sz w:val="28"/>
+          <w:szCs w:val="28"/>
+        </w:rPr>
+        <w:lastRenderedPageBreak/>
+        <w:t>and the </w:t>
       </w:r>
       <w:r>
         <w:rPr>
@@ -5934,16 +5778,7 @@
           <w:sz w:val="28"/>
           <w:szCs w:val="28"/>
         </w:rPr>
-        <w:t xml:space="preserve">. (Source: HUMA2635_11.pdf, </w:t>
-      </w:r>
-      <w:r>
-        <w:rPr>
-          <w:rFonts w:ascii="Trebuchet MS" w:hAnsi="Trebuchet MS"/>
-          <w:sz w:val="28"/>
-          <w:szCs w:val="28"/>
-        </w:rPr>
-        <w:lastRenderedPageBreak/>
-        <w:t>pp.9,18,20)</w:t>
+        <w:t>. (Source: HUMA2635_11.pdf, pp.9,18,20)</w:t>
       </w:r>
     </w:p>
     <w:p>
@@ -6309,7 +6144,18 @@
           <w:sz w:val="28"/>
           <w:szCs w:val="28"/>
         </w:rPr>
-        <w:t>male and female</w:t>
+        <w:t xml:space="preserve">male and </w:t>
+      </w:r>
+      <w:r>
+        <w:rPr>
+          <w:rFonts w:ascii="Trebuchet MS" w:hAnsi="Trebuchet MS"/>
+          <w:b/>
+          <w:bCs/>
+          <w:sz w:val="28"/>
+          <w:szCs w:val="28"/>
+        </w:rPr>
+        <w:lastRenderedPageBreak/>
+        <w:t>female</w:t>
       </w:r>
       <w:r>
         <w:rPr>
@@ -6397,7 +6243,6 @@
           <w:sz w:val="28"/>
           <w:szCs w:val="28"/>
         </w:rPr>
-        <w:lastRenderedPageBreak/>
         <w:t>The logic is circular: </w:t>
       </w:r>
       <w:r>
@@ -6702,51 +6547,26 @@
           <w:sz w:val="28"/>
           <w:szCs w:val="28"/>
         </w:rPr>
-        <w:t>In official discourse, the Han and minorities are described as </w:t>
-      </w:r>
-      <w:proofErr w:type="spellStart"/>
-      <w:r>
-        <w:rPr>
-          <w:rFonts w:ascii="Trebuchet MS" w:hAnsi="Trebuchet MS"/>
-          <w:b/>
-          <w:bCs/>
-          <w:sz w:val="28"/>
-          <w:szCs w:val="28"/>
-        </w:rPr>
-        <w:t>xiongdi</w:t>
-      </w:r>
-      <w:proofErr w:type="spellEnd"/>
-      <w:r>
-        <w:rPr>
-          <w:rFonts w:ascii="Trebuchet MS" w:hAnsi="Trebuchet MS"/>
-          <w:b/>
-          <w:bCs/>
-          <w:sz w:val="28"/>
-          <w:szCs w:val="28"/>
-        </w:rPr>
-        <w:t xml:space="preserve"> </w:t>
-      </w:r>
-      <w:proofErr w:type="spellStart"/>
-      <w:r>
-        <w:rPr>
-          <w:rFonts w:ascii="Trebuchet MS" w:hAnsi="Trebuchet MS"/>
-          <w:b/>
-          <w:bCs/>
-          <w:sz w:val="28"/>
-          <w:szCs w:val="28"/>
-        </w:rPr>
-        <w:t>minzu</w:t>
-      </w:r>
-      <w:proofErr w:type="spellEnd"/>
-      <w:r>
-        <w:rPr>
-          <w:rFonts w:ascii="Trebuchet MS" w:hAnsi="Trebuchet MS"/>
-          <w:b/>
-          <w:bCs/>
-          <w:sz w:val="28"/>
-          <w:szCs w:val="28"/>
-        </w:rPr>
-        <w:t xml:space="preserve"> (</w:t>
+        <w:t xml:space="preserve">In official discourse, the Han and minorities are described </w:t>
+      </w:r>
+      <w:r>
+        <w:rPr>
+          <w:rFonts w:ascii="Trebuchet MS" w:hAnsi="Trebuchet MS"/>
+          <w:sz w:val="28"/>
+          <w:szCs w:val="28"/>
+        </w:rPr>
+        <w:lastRenderedPageBreak/>
+        <w:t>as </w:t>
+      </w:r>
+      <w:r>
+        <w:rPr>
+          <w:rFonts w:ascii="Trebuchet MS" w:hAnsi="Trebuchet MS"/>
+          <w:b/>
+          <w:bCs/>
+          <w:sz w:val="28"/>
+          <w:szCs w:val="28"/>
+        </w:rPr>
+        <w:t>xiongdi minzu (</w:t>
       </w:r>
       <w:r>
         <w:rPr>
@@ -6784,29 +6604,7 @@
           <w:sz w:val="28"/>
           <w:szCs w:val="28"/>
         </w:rPr>
-        <w:t xml:space="preserve">big-brother / little-brother </w:t>
-      </w:r>
-      <w:proofErr w:type="spellStart"/>
-      <w:r>
-        <w:rPr>
-          <w:rFonts w:ascii="Trebuchet MS" w:hAnsi="Trebuchet MS"/>
-          <w:b/>
-          <w:bCs/>
-          <w:sz w:val="28"/>
-          <w:szCs w:val="28"/>
-        </w:rPr>
-        <w:t>minzu</w:t>
-      </w:r>
-      <w:proofErr w:type="spellEnd"/>
-      <w:r>
-        <w:rPr>
-          <w:rFonts w:ascii="Trebuchet MS" w:hAnsi="Trebuchet MS"/>
-          <w:b/>
-          <w:bCs/>
-          <w:sz w:val="28"/>
-          <w:szCs w:val="28"/>
-        </w:rPr>
-        <w:t xml:space="preserve"> (</w:t>
+        <w:t>big-brother / little-brother minzu (</w:t>
       </w:r>
       <w:r>
         <w:rPr>
@@ -6896,7 +6694,6 @@
           <w:sz w:val="28"/>
           <w:szCs w:val="28"/>
         </w:rPr>
-        <w:lastRenderedPageBreak/>
         <w:t>The child metaphor reinforces the temporal dimension</w:t>
       </w:r>
       <w:r>
@@ -7131,7 +6928,16 @@
           <w:sz w:val="28"/>
           <w:szCs w:val="28"/>
         </w:rPr>
-        <w:t>Almost any difference between center and periphery can be translated into a </w:t>
+        <w:t xml:space="preserve">Almost any difference between center and periphery can be </w:t>
+      </w:r>
+      <w:r>
+        <w:rPr>
+          <w:rFonts w:ascii="Trebuchet MS" w:hAnsi="Trebuchet MS"/>
+          <w:sz w:val="28"/>
+          <w:szCs w:val="28"/>
+        </w:rPr>
+        <w:lastRenderedPageBreak/>
+        <w:t>translated into a </w:t>
       </w:r>
       <w:r>
         <w:rPr>
@@ -7189,7 +6995,6 @@
           <w:sz w:val="28"/>
           <w:szCs w:val="28"/>
         </w:rPr>
-        <w:lastRenderedPageBreak/>
         <w:t>By portraying peripheral peoples as </w:t>
       </w:r>
       <w:r>
@@ -7482,8 +7287,54 @@
           <w:sz w:val="28"/>
           <w:szCs w:val="28"/>
         </w:rPr>
-        <w:t xml:space="preserve">According to the course materials, over the last few centuries China's ethnic minorities have been subjected to a series of </w:t>
-      </w:r>
+        <w:t>According to the course materials, over the last few centuries China's ethnic minorities have been subjected to a series of civilizing projects by dominant powers seeking to transform them. Three major civilizing centers — the Confucians, Western missionaries, and Communists — have operated with different assumptions of hierarchy based respectively on moral values, revealed religious truth, and a scientific scale of material stages (HUMA2635_11, pp.2,4). In representing peripheral peoples to themselves and others, these civilizing centers have relied on three recurring metaphors: minorities as women, as children, and as ancient peoples.</w:t>
+      </w:r>
+    </w:p>
+    <w:p>
+      <w:pPr>
+        <w:jc w:val="left"/>
+        <w:rPr>
+          <w:rFonts w:ascii="Trebuchet MS" w:hAnsi="Trebuchet MS"/>
+          <w:sz w:val="28"/>
+          <w:szCs w:val="28"/>
+        </w:rPr>
+      </w:pPr>
+      <w:r>
+        <w:rPr>
+          <w:rFonts w:ascii="Trebuchet MS" w:hAnsi="Trebuchet MS"/>
+          <w:sz w:val="28"/>
+          <w:szCs w:val="28"/>
+        </w:rPr>
+        <w:t xml:space="preserve">The first metaphor portrays ethnic minorities as women. The civilizers have seen peripheral </w:t>
+      </w:r>
+      <w:proofErr w:type="gramStart"/>
+      <w:r>
+        <w:rPr>
+          <w:rFonts w:ascii="Trebuchet MS" w:hAnsi="Trebuchet MS"/>
+          <w:sz w:val="28"/>
+          <w:szCs w:val="28"/>
+        </w:rPr>
+        <w:t>peoples</w:t>
+      </w:r>
+      <w:proofErr w:type="gramEnd"/>
+      <w:r>
+        <w:rPr>
+          <w:rFonts w:ascii="Trebuchet MS" w:hAnsi="Trebuchet MS"/>
+          <w:sz w:val="28"/>
+          <w:szCs w:val="28"/>
+        </w:rPr>
+        <w:t xml:space="preserve"> as erotic and promiscuous, at a lower level of culture where they have not yet learned the "proper civilized morals of sexual repression and/or hypocrisy" (HUMA2635_11, p.9). This objectification creates an analogy whereby the Han majority and non-Han minorities are positioned like male and female — both minorities and women are subordinate categories under the tutelage of the state's civilizing project (HUMA2635_11, p.13).</w:t>
+      </w:r>
+    </w:p>
+    <w:p>
+      <w:pPr>
+        <w:jc w:val="left"/>
+        <w:rPr>
+          <w:rFonts w:ascii="Trebuchet MS" w:hAnsi="Trebuchet MS"/>
+          <w:sz w:val="28"/>
+          <w:szCs w:val="28"/>
+        </w:rPr>
+      </w:pPr>
       <w:r>
         <w:rPr>
           <w:rFonts w:ascii="Trebuchet MS" w:hAnsi="Trebuchet MS"/>
@@ -7491,7 +7342,25 @@
           <w:szCs w:val="28"/>
         </w:rPr>
         <w:lastRenderedPageBreak/>
-        <w:t>civilizing projects by dominant powers seeking to transform them. Three major civilizing centers — the Confucians, Western missionaries, and Communists — have operated with different assumptions of hierarchy based respectively on moral values, revealed religious truth, and a scientific scale of material stages (HUMA2635_11, pp.2,4). In representing peripheral peoples to themselves and others, these civilizing centers have relied on three recurring metaphors: minorities as women, as children, and as ancient peoples.</w:t>
+        <w:t xml:space="preserve">The second metaphor depicts minorities as children. Seeing peripheral </w:t>
+      </w:r>
+      <w:proofErr w:type="gramStart"/>
+      <w:r>
+        <w:rPr>
+          <w:rFonts w:ascii="Trebuchet MS" w:hAnsi="Trebuchet MS"/>
+          <w:sz w:val="28"/>
+          <w:szCs w:val="28"/>
+        </w:rPr>
+        <w:t>peoples</w:t>
+      </w:r>
+      <w:proofErr w:type="gramEnd"/>
+      <w:r>
+        <w:rPr>
+          <w:rFonts w:ascii="Trebuchet MS" w:hAnsi="Trebuchet MS"/>
+          <w:sz w:val="28"/>
+          <w:szCs w:val="28"/>
+        </w:rPr>
+        <w:t xml:space="preserve"> as childlike presents them as both inferior and educable, making the task of the center one of benevolent tutelage (HUMA2635_11, p.18). This is reflected in official discourse where Han and minorities are termed xiongdi minzu (brother nationalities), with the Han implicitly occupying the role of elder brother (HUMA2635_11, p.18).</w:t>
       </w:r>
     </w:p>
     <w:p>
@@ -7509,25 +7378,7 @@
           <w:sz w:val="28"/>
           <w:szCs w:val="28"/>
         </w:rPr>
-        <w:t xml:space="preserve">The first metaphor portrays ethnic minorities as women. The civilizers have seen peripheral </w:t>
-      </w:r>
-      <w:proofErr w:type="gramStart"/>
-      <w:r>
-        <w:rPr>
-          <w:rFonts w:ascii="Trebuchet MS" w:hAnsi="Trebuchet MS"/>
-          <w:sz w:val="28"/>
-          <w:szCs w:val="28"/>
-        </w:rPr>
-        <w:t>peoples</w:t>
-      </w:r>
-      <w:proofErr w:type="gramEnd"/>
-      <w:r>
-        <w:rPr>
-          <w:rFonts w:ascii="Trebuchet MS" w:hAnsi="Trebuchet MS"/>
-          <w:sz w:val="28"/>
-          <w:szCs w:val="28"/>
-        </w:rPr>
-        <w:t xml:space="preserve"> as erotic and promiscuous, at a lower level of culture where they have not yet learned the "proper civilized morals of sexual repression and/or hypocrisy" (HUMA2635_11, p.9). This objectification creates an analogy whereby the Han majority and non-Han minorities are positioned like male and female — both minorities and women are subordinate categories under the tutelage of the state's civilizing project (HUMA2635_11, p.13).</w:t>
+        <w:t>The third metaphor frames minorities as ancient and unchanged — not so far along on the same historical scale as the civilizer center. If the ancestors of the center were once as primitive as the periphery is now, then the project of civilizing them has some chance of success (HUMA2635_11, p.20). Almost any cultural difference can be translated into a historical gap representing different evolutionary stages (HUMA2635_11, p.22).</w:t>
       </w:r>
     </w:p>
     <w:p>
@@ -7545,25 +7396,7 @@
           <w:sz w:val="28"/>
           <w:szCs w:val="28"/>
         </w:rPr>
-        <w:t xml:space="preserve">The second metaphor depicts minorities as children. Seeing peripheral </w:t>
-      </w:r>
-      <w:proofErr w:type="gramStart"/>
-      <w:r>
-        <w:rPr>
-          <w:rFonts w:ascii="Trebuchet MS" w:hAnsi="Trebuchet MS"/>
-          <w:sz w:val="28"/>
-          <w:szCs w:val="28"/>
-        </w:rPr>
-        <w:t>peoples</w:t>
-      </w:r>
-      <w:proofErr w:type="gramEnd"/>
-      <w:r>
-        <w:rPr>
-          <w:rFonts w:ascii="Trebuchet MS" w:hAnsi="Trebuchet MS"/>
-          <w:sz w:val="28"/>
-          <w:szCs w:val="28"/>
-        </w:rPr>
-        <w:t xml:space="preserve"> as childlike presents them as both inferior and educable, making the task of the center one of benevolent tutelage (HUMA2635_11, p.18). This is reflected in official </w:t>
+        <w:t xml:space="preserve">Together, these three metaphors function as a legitimizing framework. By portraying peripheral peoples as female, childlike, and historical, the Han center — which is by implicit contrast male, adult, and modern — legitimately assumes the task of civilizing and with it a superior political and moral position (HUMA2635_11, p.25). This framework transforms what is fundamentally a relationship of political and economic inequality into one that appears natural, benevolent, and provisional. The </w:t>
       </w:r>
       <w:r>
         <w:rPr>
@@ -7572,79 +7405,7 @@
           <w:szCs w:val="28"/>
         </w:rPr>
         <w:lastRenderedPageBreak/>
-        <w:t xml:space="preserve">discourse where Han and minorities are termed </w:t>
-      </w:r>
-      <w:proofErr w:type="spellStart"/>
-      <w:r>
-        <w:rPr>
-          <w:rFonts w:ascii="Trebuchet MS" w:hAnsi="Trebuchet MS"/>
-          <w:sz w:val="28"/>
-          <w:szCs w:val="28"/>
-        </w:rPr>
-        <w:t>xiongdi</w:t>
-      </w:r>
-      <w:proofErr w:type="spellEnd"/>
-      <w:r>
-        <w:rPr>
-          <w:rFonts w:ascii="Trebuchet MS" w:hAnsi="Trebuchet MS"/>
-          <w:sz w:val="28"/>
-          <w:szCs w:val="28"/>
-        </w:rPr>
-        <w:t xml:space="preserve"> </w:t>
-      </w:r>
-      <w:proofErr w:type="spellStart"/>
-      <w:r>
-        <w:rPr>
-          <w:rFonts w:ascii="Trebuchet MS" w:hAnsi="Trebuchet MS"/>
-          <w:sz w:val="28"/>
-          <w:szCs w:val="28"/>
-        </w:rPr>
-        <w:t>minzu</w:t>
-      </w:r>
-      <w:proofErr w:type="spellEnd"/>
-      <w:r>
-        <w:rPr>
-          <w:rFonts w:ascii="Trebuchet MS" w:hAnsi="Trebuchet MS"/>
-          <w:sz w:val="28"/>
-          <w:szCs w:val="28"/>
-        </w:rPr>
-        <w:t xml:space="preserve"> (brother nationalities), with the Han implicitly occupying the role of elder brother (HUMA2635_11, p.18).</w:t>
-      </w:r>
-    </w:p>
-    <w:p>
-      <w:pPr>
-        <w:jc w:val="left"/>
-        <w:rPr>
-          <w:rFonts w:ascii="Trebuchet MS" w:hAnsi="Trebuchet MS"/>
-          <w:sz w:val="28"/>
-          <w:szCs w:val="28"/>
-        </w:rPr>
-      </w:pPr>
-      <w:r>
-        <w:rPr>
-          <w:rFonts w:ascii="Trebuchet MS" w:hAnsi="Trebuchet MS"/>
-          <w:sz w:val="28"/>
-          <w:szCs w:val="28"/>
-        </w:rPr>
-        <w:t>The third metaphor frames minorities as ancient and unchanged — not so far along on the same historical scale as the civilizer center. If the ancestors of the center were once as primitive as the periphery is now, then the project of civilizing them has some chance of success (HUMA2635_11, p.20). Almost any cultural difference can be translated into a historical gap representing different evolutionary stages (HUMA2635_11, p.22).</w:t>
-      </w:r>
-    </w:p>
-    <w:p>
-      <w:pPr>
-        <w:jc w:val="left"/>
-        <w:rPr>
-          <w:rFonts w:ascii="Trebuchet MS" w:hAnsi="Trebuchet MS"/>
-          <w:sz w:val="28"/>
-          <w:szCs w:val="28"/>
-        </w:rPr>
-      </w:pPr>
-      <w:r>
-        <w:rPr>
-          <w:rFonts w:ascii="Trebuchet MS" w:hAnsi="Trebuchet MS"/>
-          <w:sz w:val="28"/>
-          <w:szCs w:val="28"/>
-        </w:rPr>
-        <w:t>Together, these three metaphors function as a legitimizing framework. By portraying peripheral peoples as female, childlike, and historical, the Han center — which is by implicit contrast male, adult, and modern — legitimately assumes the task of civilizing and with it a superior political and moral position (HUMA2635_11, p.25). This framework transforms what is fundamentally a relationship of political and economic inequality into one that appears natural, benevolent, and provisional. The assumption of cultural superiority thus becomes an integral aspect of hegemonic rule over China's peripheral peoples.</w:t>
+        <w:t>assumption of cultural superiority thus becomes an integral aspect of hegemonic rule over China's peripheral peoples.</w:t>
       </w:r>
     </w:p>
     <w:p>
@@ -7682,38 +7443,37 @@
           <w:sz w:val="32"/>
           <w:szCs w:val="32"/>
         </w:rPr>
-        <w:t xml:space="preserve">Please compare two minority autonomous regions </w:t>
-      </w:r>
-      <w:r>
-        <w:rPr>
-          <w:rFonts w:ascii="Trebuchet MS" w:hAnsi="Trebuchet MS"/>
+        <w:t>Please compare two minority autonomous regions Xinjiang and Tibet in terms of</w:t>
+      </w:r>
+      <w:r>
+        <w:rPr>
+          <w:rFonts w:ascii="Trebuchet MS" w:hAnsi="Trebuchet MS" w:hint="eastAsia"/>
           <w:b/>
           <w:bCs/>
           <w:sz w:val="32"/>
           <w:szCs w:val="32"/>
         </w:rPr>
-        <w:lastRenderedPageBreak/>
-        <w:t>Xinjiang and Tibet in terms of</w:t>
-      </w:r>
-      <w:r>
-        <w:rPr>
-          <w:rFonts w:ascii="Trebuchet MS" w:hAnsi="Trebuchet MS" w:hint="eastAsia"/>
+        <w:t xml:space="preserve"> </w:t>
+      </w:r>
+      <w:r>
+        <w:rPr>
+          <w:rFonts w:ascii="Trebuchet MS" w:hAnsi="Trebuchet MS"/>
           <w:b/>
           <w:bCs/>
           <w:sz w:val="32"/>
           <w:szCs w:val="32"/>
         </w:rPr>
-        <w:t xml:space="preserve"> </w:t>
-      </w:r>
-      <w:r>
-        <w:rPr>
-          <w:rFonts w:ascii="Trebuchet MS" w:hAnsi="Trebuchet MS"/>
+        <w:t>geography, cultural difference and their relationship with the Han majority.</w:t>
+      </w:r>
+      <w:r>
+        <w:rPr>
+          <w:rFonts w:ascii="Trebuchet MS" w:hAnsi="Trebuchet MS" w:hint="eastAsia"/>
           <w:b/>
           <w:bCs/>
           <w:sz w:val="32"/>
           <w:szCs w:val="32"/>
         </w:rPr>
-        <w:t>geography, cultural difference and their relationship with the Han majority.</w:t>
+        <w:t xml:space="preserve"> </w:t>
       </w:r>
       <w:r>
         <w:rPr>
@@ -7723,17 +7483,17 @@
           <w:sz w:val="32"/>
           <w:szCs w:val="32"/>
         </w:rPr>
-        <w:t xml:space="preserve"> </w:t>
+        <w:t>这个点</w:t>
       </w:r>
       <w:r>
         <w:rPr>
           <w:rFonts w:ascii="Trebuchet MS" w:hAnsi="Trebuchet MS" w:hint="eastAsia"/>
           <w:b/>
           <w:bCs/>
-          <w:sz w:val="32"/>
-          <w:szCs w:val="32"/>
-        </w:rPr>
-        <w:t>这个点</w:t>
+          <w:sz w:val="28"/>
+          <w:szCs w:val="28"/>
+        </w:rPr>
+        <w:t>需要检查，</w:t>
       </w:r>
       <w:r>
         <w:rPr>
@@ -7743,7 +7503,7 @@
           <w:sz w:val="28"/>
           <w:szCs w:val="28"/>
         </w:rPr>
-        <w:t>需要检查，</w:t>
+        <w:t>被</w:t>
       </w:r>
       <w:r>
         <w:rPr>
@@ -7753,20 +7513,8 @@
           <w:sz w:val="28"/>
           <w:szCs w:val="28"/>
         </w:rPr>
-        <w:t>被</w:t>
-      </w:r>
-      <w:proofErr w:type="spellStart"/>
-      <w:r>
-        <w:rPr>
-          <w:rFonts w:ascii="Trebuchet MS" w:hAnsi="Trebuchet MS" w:hint="eastAsia"/>
-          <w:b/>
-          <w:bCs/>
-          <w:sz w:val="28"/>
-          <w:szCs w:val="28"/>
-        </w:rPr>
         <w:t>deepseek</w:t>
       </w:r>
-      <w:proofErr w:type="spellEnd"/>
       <w:r>
         <w:rPr>
           <w:rFonts w:ascii="Trebuchet MS" w:hAnsi="Trebuchet MS" w:hint="eastAsia"/>
@@ -7930,25 +7678,7 @@
           <w:sz w:val="28"/>
           <w:szCs w:val="28"/>
         </w:rPr>
-        <w:t xml:space="preserve">Islam; 10 Muslim nationalities; </w:t>
-      </w:r>
-      <w:proofErr w:type="spellStart"/>
-      <w:r>
-        <w:rPr>
-          <w:rFonts w:ascii="Trebuchet MS" w:hAnsi="Trebuchet MS"/>
-          <w:sz w:val="28"/>
-          <w:szCs w:val="28"/>
-        </w:rPr>
-        <w:t>Lamaist</w:t>
-      </w:r>
-      <w:proofErr w:type="spellEnd"/>
-      <w:r>
-        <w:rPr>
-          <w:rFonts w:ascii="Trebuchet MS" w:hAnsi="Trebuchet MS"/>
-          <w:sz w:val="28"/>
-          <w:szCs w:val="28"/>
-        </w:rPr>
-        <w:t xml:space="preserve"> Buddhism; Living Buddha; oasis culture vs. scattered distribution</w:t>
+        <w:t>Islam; 10 Muslim nationalities; Lamaist Buddhism; Living Buddha; oasis culture vs. scattered distribution</w:t>
       </w:r>
       <w:r>
         <w:rPr>
@@ -7968,25 +7698,25 @@
         </w:numPr>
         <w:jc w:val="left"/>
         <w:rPr>
+          <w:rFonts w:ascii="Trebuchet MS" w:hAnsi="Trebuchet MS"/>
+          <w:sz w:val="28"/>
+          <w:szCs w:val="28"/>
+        </w:rPr>
+      </w:pPr>
+      <w:r>
+        <w:rPr>
+          <w:rFonts w:ascii="Trebuchet MS" w:hAnsi="Trebuchet MS"/>
+          <w:sz w:val="28"/>
+          <w:szCs w:val="28"/>
+        </w:rPr>
+        <w:t>Compare their relationship with the Han majority (migration and integration; tea and horse trade; intermarriage vs. demographic shift)</w:t>
+      </w:r>
+      <w:r>
+        <w:rPr>
           <w:rFonts w:ascii="Trebuchet MS" w:hAnsi="Trebuchet MS" w:hint="eastAsia"/>
           <w:sz w:val="28"/>
           <w:szCs w:val="28"/>
         </w:rPr>
-      </w:pPr>
-      <w:r>
-        <w:rPr>
-          <w:rFonts w:ascii="Trebuchet MS" w:hAnsi="Trebuchet MS"/>
-          <w:sz w:val="28"/>
-          <w:szCs w:val="28"/>
-        </w:rPr>
-        <w:t>Compare their relationship with the Han majority (migration and integration; tea and horse trade; intermarriage vs. demographic shift)</w:t>
-      </w:r>
-      <w:r>
-        <w:rPr>
-          <w:rFonts w:ascii="Trebuchet MS" w:hAnsi="Trebuchet MS" w:hint="eastAsia"/>
-          <w:sz w:val="28"/>
-          <w:szCs w:val="28"/>
-        </w:rPr>
         <w:t xml:space="preserve"> </w:t>
       </w:r>
     </w:p>
@@ -8005,7 +7735,7 @@
     <w:p>
       <w:pPr>
         <w:rPr>
-          <w:rFonts w:ascii="Trebuchet MS" w:hAnsi="Trebuchet MS" w:hint="eastAsia"/>
+          <w:rFonts w:ascii="Trebuchet MS" w:hAnsi="Trebuchet MS"/>
           <w:b/>
           <w:bCs/>
           <w:i/>
@@ -8098,7 +7828,16 @@
           <w:sz w:val="28"/>
           <w:szCs w:val="28"/>
         </w:rPr>
-        <w:t xml:space="preserve"> by great distances, which fostered social and cultural </w:t>
+        <w:t xml:space="preserve"> by </w:t>
+      </w:r>
+      <w:r>
+        <w:rPr>
+          <w:rFonts w:ascii="Trebuchet MS" w:hAnsi="Trebuchet MS"/>
+          <w:sz w:val="28"/>
+          <w:szCs w:val="28"/>
+        </w:rPr>
+        <w:lastRenderedPageBreak/>
+        <w:t xml:space="preserve">great distances, which fostered social and cultural </w:t>
       </w:r>
       <w:r>
         <w:rPr>
@@ -8156,16 +7895,7 @@
           <w:sz w:val="28"/>
           <w:szCs w:val="28"/>
         </w:rPr>
-        <w:t xml:space="preserve">, where indigenous peoples relied on cold-resistant crops and </w:t>
-      </w:r>
-      <w:r>
-        <w:rPr>
-          <w:rFonts w:ascii="Trebuchet MS" w:hAnsi="Trebuchet MS"/>
-          <w:sz w:val="28"/>
-          <w:szCs w:val="28"/>
-        </w:rPr>
-        <w:lastRenderedPageBreak/>
-        <w:t>inland tea. (Source: HUMA2635_10.pdf, p.8)</w:t>
+        <w:t>, where indigenous peoples relied on cold-resistant crops and inland tea. (Source: HUMA2635_10.pdf, p.8)</w:t>
       </w:r>
     </w:p>
     <w:p>
@@ -8345,25 +8075,7 @@
           <w:sz w:val="28"/>
           <w:szCs w:val="28"/>
         </w:rPr>
-        <w:t xml:space="preserve">In Tibet, society centers on </w:t>
-      </w:r>
-      <w:proofErr w:type="spellStart"/>
-      <w:r>
-        <w:rPr>
-          <w:rFonts w:ascii="Trebuchet MS" w:hAnsi="Trebuchet MS"/>
-          <w:sz w:val="28"/>
-          <w:szCs w:val="28"/>
-        </w:rPr>
-        <w:t>Lamaist</w:t>
-      </w:r>
-      <w:proofErr w:type="spellEnd"/>
-      <w:r>
-        <w:rPr>
-          <w:rFonts w:ascii="Trebuchet MS" w:hAnsi="Trebuchet MS"/>
-          <w:sz w:val="28"/>
-          <w:szCs w:val="28"/>
-        </w:rPr>
-        <w:t xml:space="preserve"> Buddhism, where the </w:t>
+        <w:t xml:space="preserve">In Tibet, society centers on Lamaist Buddhism, where the </w:t>
       </w:r>
       <w:r>
         <w:rPr>
@@ -8463,7 +8175,16 @@
           <w:sz w:val="28"/>
           <w:szCs w:val="28"/>
         </w:rPr>
-        <w:t>. (Source: HUMA2635_7.pdf, p.56; HUMA2635_8.pdf, p.52)</w:t>
+        <w:t xml:space="preserve">. (Source: HUMA2635_7.pdf, p.56; </w:t>
+      </w:r>
+      <w:r>
+        <w:rPr>
+          <w:rFonts w:ascii="Trebuchet MS" w:hAnsi="Trebuchet MS"/>
+          <w:sz w:val="28"/>
+          <w:szCs w:val="28"/>
+        </w:rPr>
+        <w:lastRenderedPageBreak/>
+        <w:t>HUMA2635_8.pdf, p.52)</w:t>
       </w:r>
     </w:p>
     <w:p>
@@ -8539,7 +8260,6 @@
           <w:sz w:val="28"/>
           <w:szCs w:val="28"/>
         </w:rPr>
-        <w:lastRenderedPageBreak/>
         <w:t xml:space="preserve">The Qing government reformed Tibetan administration by requiring the Dalai Lama to be </w:t>
       </w:r>
       <w:r>
@@ -8758,6 +8478,7 @@
           <w:sz w:val="28"/>
           <w:szCs w:val="28"/>
         </w:rPr>
+        <w:lastRenderedPageBreak/>
         <w:t>more distinct ethnic boundaries</w:t>
       </w:r>
       <w:r>
@@ -8806,7 +8527,77 @@
           <w:sz w:val="28"/>
           <w:szCs w:val="28"/>
         </w:rPr>
-        <w:t xml:space="preserve">, a barter system </w:t>
+        <w:t>, a barter system exchanging interior agricultural goods like tea for nomad horses. (Source: HUMA2635_10.pdf, p.19)</w:t>
+      </w:r>
+    </w:p>
+    <w:p>
+      <w:pPr>
+        <w:jc w:val="left"/>
+        <w:rPr>
+          <w:rFonts w:ascii="Trebuchet MS" w:hAnsi="Trebuchet MS"/>
+          <w:b/>
+          <w:bCs/>
+          <w:sz w:val="28"/>
+          <w:szCs w:val="28"/>
+        </w:rPr>
+      </w:pPr>
+    </w:p>
+    <w:p>
+      <w:pPr>
+        <w:jc w:val="left"/>
+        <w:rPr>
+          <w:rFonts w:ascii="Trebuchet MS" w:hAnsi="Trebuchet MS"/>
+          <w:b/>
+          <w:bCs/>
+          <w:sz w:val="28"/>
+          <w:szCs w:val="28"/>
+        </w:rPr>
+      </w:pPr>
+      <w:r>
+        <w:rPr>
+          <w:rFonts w:ascii="Trebuchet MS" w:hAnsi="Trebuchet MS" w:hint="eastAsia"/>
+          <w:b/>
+          <w:bCs/>
+          <w:sz w:val="28"/>
+          <w:szCs w:val="28"/>
+        </w:rPr>
+        <w:t xml:space="preserve">EXAMPLE: </w:t>
+      </w:r>
+    </w:p>
+    <w:p>
+      <w:pPr>
+        <w:jc w:val="left"/>
+        <w:rPr>
+          <w:rFonts w:ascii="Trebuchet MS" w:hAnsi="Trebuchet MS"/>
+          <w:sz w:val="28"/>
+          <w:szCs w:val="28"/>
+        </w:rPr>
+      </w:pPr>
+      <w:r>
+        <w:rPr>
+          <w:rFonts w:ascii="Trebuchet MS" w:hAnsi="Trebuchet MS"/>
+          <w:sz w:val="28"/>
+          <w:szCs w:val="28"/>
+        </w:rPr>
+        <w:t>Xinjiang and Tibet, two major minority autonomous regions in China, present stark geographical contrasts. Xinjiang's landscape is defined by vast deserts and isolated settlements, where oases separated by great distances have historically fostered social and cultural diversity (HUMA2635_8.pdf, p. 37). The oases identities and economic structures set the basic features for Xinjiang society (HUMA2635_8.pdf, p. 53). Conversely, Tibet is characterized by its high altitude and marginal lands. The indigenous peoples of these harsh environments relied heavily on cold-resistant crops like barley, mountain animals, and inland tea to survive (HUMA2635_10.pdf, p. 8; HUMA2635_10.pdf, p. 16).</w:t>
+      </w:r>
+    </w:p>
+    <w:p>
+      <w:pPr>
+        <w:jc w:val="left"/>
+        <w:rPr>
+          <w:rFonts w:ascii="Trebuchet MS" w:hAnsi="Trebuchet MS"/>
+          <w:sz w:val="28"/>
+          <w:szCs w:val="28"/>
+        </w:rPr>
+      </w:pPr>
+      <w:r>
+        <w:rPr>
+          <w:rFonts w:ascii="Trebuchet MS" w:hAnsi="Trebuchet MS"/>
+          <w:sz w:val="28"/>
+          <w:szCs w:val="28"/>
+        </w:rPr>
+        <w:t xml:space="preserve">Culturally, the two regions belong to entirely different religious spheres. In Xinjiang, the Uyghur ethnic identity became closely tied to Islam (HUMA2635_8.pdf, p. 22). Islamic practices vary </w:t>
       </w:r>
       <w:r>
         <w:rPr>
@@ -8815,7 +8606,7 @@
           <w:szCs w:val="28"/>
         </w:rPr>
         <w:lastRenderedPageBreak/>
-        <w:t>exchanging interior agricultural goods like tea for nomad horses. (Source: HUMA2635_10.pdf, p.19)</w:t>
+        <w:t>regionally; for instance, Kashgar remains the conservative Islamic heartland, while Turpan, the historic center of Uyghur culture, is relatively less conservative (HUMA2635_8.pdf, p. 39; HUMA2635_8.pdf, p. 50). In contrast, Tibetan culture is deeply centered around Lamaist Buddhism. The Dalai Lama was recognized as holding both temporal and spiritual rule, acting not merely as an official but as the reincarnation of a Living Buddha (HUMA2635_10.pdf, p. 6; HUMA2635_10.pdf, p. 8).</w:t>
       </w:r>
     </w:p>
     <w:p>
@@ -8823,121 +8614,24 @@
         <w:jc w:val="left"/>
         <w:rPr>
           <w:rFonts w:ascii="Trebuchet MS" w:hAnsi="Trebuchet MS"/>
-          <w:b/>
-          <w:bCs/>
-          <w:sz w:val="28"/>
-          <w:szCs w:val="28"/>
-        </w:rPr>
-      </w:pPr>
+          <w:sz w:val="28"/>
+          <w:szCs w:val="28"/>
+        </w:rPr>
+      </w:pPr>
+      <w:r>
+        <w:rPr>
+          <w:rFonts w:ascii="Trebuchet MS" w:hAnsi="Trebuchet MS"/>
+          <w:sz w:val="28"/>
+          <w:szCs w:val="28"/>
+        </w:rPr>
+        <w:t>The historical and demographic relationships between these regions and the Han majority also differ significantly. In Xinjiang, Han immigration has massively transformed the demographic landscape. The Han population grew from merely 10% in 1949 to around 40% in recent censuses, supported by institutions like the Xinjiang Production and Construction Corps (HUMA2635_8.pdf, p. 9). Conversely, Han immigration into Tibetan areas was not heavy prior to 1949, and the Han proportion in the Tibet Autonomous Region remained very low, reaching only about 8.17% in 2010 (HUMA2635_10.pdf, p. 8; HUMA2635_8.pdf, p. 9). Despite the lack of large-scale settlement, Tibet maintained strong historical ties with the Han majority through the tea and horse trade, an institutionalized barter economy between inland agriculturists and Tibetan nomads (HUMA2635_10.pdf, p. 19).</w:t>
+      </w:r>
     </w:p>
     <w:p>
       <w:pPr>
         <w:jc w:val="left"/>
         <w:rPr>
-          <w:rFonts w:ascii="Trebuchet MS" w:hAnsi="Trebuchet MS" w:hint="eastAsia"/>
-          <w:b/>
-          <w:bCs/>
-          <w:sz w:val="28"/>
-          <w:szCs w:val="28"/>
-        </w:rPr>
-      </w:pPr>
-      <w:r>
-        <w:rPr>
-          <w:rFonts w:ascii="Trebuchet MS" w:hAnsi="Trebuchet MS" w:hint="eastAsia"/>
-          <w:b/>
-          <w:bCs/>
-          <w:sz w:val="28"/>
-          <w:szCs w:val="28"/>
-        </w:rPr>
-        <w:t xml:space="preserve">EXAMPLE: </w:t>
-      </w:r>
-    </w:p>
-    <w:p>
-      <w:pPr>
-        <w:jc w:val="left"/>
-        <w:rPr>
-          <w:rFonts w:ascii="Trebuchet MS" w:hAnsi="Trebuchet MS"/>
-          <w:sz w:val="28"/>
-          <w:szCs w:val="28"/>
-        </w:rPr>
-      </w:pPr>
-      <w:r>
-        <w:rPr>
-          <w:rFonts w:ascii="Trebuchet MS" w:hAnsi="Trebuchet MS"/>
-          <w:sz w:val="28"/>
-          <w:szCs w:val="28"/>
-        </w:rPr>
-        <w:t>Xinjiang and Tibet, two major minority autonomous regions in China, present stark geographical contrasts. Xinjiang's landscape is defined by vast deserts and isolated settlements, where oases separated by great distances have historically fostered social and cultural diversity (HUMA2635_8.pdf, p. 37). The oases identities and economic structures set the basic features for Xinjiang society (HUMA2635_8.pdf, p. 53). Conversely, Tibet is characterized by its high altitude and marginal lands. The indigenous peoples of these harsh environments relied heavily on cold-resistant crops like barley, mountain animals, and inland tea to survive (HUMA2635_10.pdf, p. 8; HUMA2635_10.pdf, p. 16).</w:t>
-      </w:r>
-    </w:p>
-    <w:p>
-      <w:pPr>
-        <w:jc w:val="left"/>
-        <w:rPr>
-          <w:rFonts w:ascii="Trebuchet MS" w:hAnsi="Trebuchet MS"/>
-          <w:sz w:val="28"/>
-          <w:szCs w:val="28"/>
-        </w:rPr>
-      </w:pPr>
-      <w:r>
-        <w:rPr>
-          <w:rFonts w:ascii="Trebuchet MS" w:hAnsi="Trebuchet MS"/>
-          <w:sz w:val="28"/>
-          <w:szCs w:val="28"/>
-        </w:rPr>
-        <w:t xml:space="preserve">Culturally, the two regions belong to entirely different religious spheres. In Xinjiang, the Uyghur ethnic identity became closely tied to Islam (HUMA2635_8.pdf, p. 22). Islamic practices vary regionally; for instance, Kashgar remains the conservative Islamic heartland, while Turpan, the historic center of Uyghur culture, is relatively less conservative (HUMA2635_8.pdf, p. 39; HUMA2635_8.pdf, p. 50). In contrast, Tibetan culture is deeply </w:t>
-      </w:r>
-      <w:r>
-        <w:rPr>
-          <w:rFonts w:ascii="Trebuchet MS" w:hAnsi="Trebuchet MS"/>
-          <w:sz w:val="28"/>
-          <w:szCs w:val="28"/>
-        </w:rPr>
-        <w:lastRenderedPageBreak/>
-        <w:t xml:space="preserve">centered around </w:t>
-      </w:r>
-      <w:proofErr w:type="spellStart"/>
-      <w:r>
-        <w:rPr>
-          <w:rFonts w:ascii="Trebuchet MS" w:hAnsi="Trebuchet MS"/>
-          <w:sz w:val="28"/>
-          <w:szCs w:val="28"/>
-        </w:rPr>
-        <w:t>Lamaist</w:t>
-      </w:r>
-      <w:proofErr w:type="spellEnd"/>
-      <w:r>
-        <w:rPr>
-          <w:rFonts w:ascii="Trebuchet MS" w:hAnsi="Trebuchet MS"/>
-          <w:sz w:val="28"/>
-          <w:szCs w:val="28"/>
-        </w:rPr>
-        <w:t xml:space="preserve"> Buddhism. The Dalai Lama was recognized as holding both temporal and spiritual rule, acting not merely as an official but as the reincarnation of a Living Buddha (HUMA2635_10.pdf, p. 6; HUMA2635_10.pdf, p. 8).</w:t>
-      </w:r>
-    </w:p>
-    <w:p>
-      <w:pPr>
-        <w:jc w:val="left"/>
-        <w:rPr>
-          <w:rFonts w:ascii="Trebuchet MS" w:hAnsi="Trebuchet MS"/>
-          <w:sz w:val="28"/>
-          <w:szCs w:val="28"/>
-        </w:rPr>
-      </w:pPr>
-      <w:r>
-        <w:rPr>
-          <w:rFonts w:ascii="Trebuchet MS" w:hAnsi="Trebuchet MS"/>
-          <w:sz w:val="28"/>
-          <w:szCs w:val="28"/>
-        </w:rPr>
-        <w:t>The historical and demographic relationships between these regions and the Han majority also differ significantly. In Xinjiang, Han immigration has massively transformed the demographic landscape. The Han population grew from merely 10% in 1949 to around 40% in recent censuses, supported by institutions like the Xinjiang Production and Construction Corps (HUMA2635_8.pdf, p. 9). Conversely, Han immigration into Tibetan areas was not heavy prior to 1949, and the Han proportion in the Tibet Autonomous Region remained very low, reaching only about 8.17% in 2010 (HUMA2635_10.pdf, p. 8; HUMA2635_8.pdf, p. 9). Despite the lack of large-scale settlement, Tibet maintained strong historical ties with the Han majority through the tea and horse trade, an institutionalized barter economy between inland agriculturists and Tibetan nomads (HUMA2635_10.pdf, p. 19).</w:t>
-      </w:r>
-    </w:p>
-    <w:p>
-      <w:pPr>
-        <w:jc w:val="left"/>
-        <w:rPr>
-          <w:rFonts w:ascii="Trebuchet MS" w:hAnsi="Trebuchet MS" w:hint="eastAsia"/>
+          <w:rFonts w:ascii="Trebuchet MS" w:hAnsi="Trebuchet MS"/>
           <w:b/>
           <w:bCs/>
           <w:sz w:val="28"/>
@@ -9023,7 +8717,6 @@
           <w:sz w:val="28"/>
           <w:szCs w:val="28"/>
         </w:rPr>
-        <w:lastRenderedPageBreak/>
         <w:t>Introduce Tibet's traditional theocratic society and the central role of Buddhism</w:t>
       </w:r>
       <w:r>
@@ -9226,7 +8919,7 @@
     <w:p>
       <w:pPr>
         <w:rPr>
-          <w:rFonts w:ascii="Trebuchet MS" w:hAnsi="Trebuchet MS" w:hint="eastAsia"/>
+          <w:rFonts w:ascii="Trebuchet MS" w:hAnsi="Trebuchet MS"/>
           <w:b/>
           <w:bCs/>
           <w:i/>
@@ -9297,6 +8990,7 @@
           <w:sz w:val="28"/>
           <w:szCs w:val="28"/>
         </w:rPr>
+        <w:lastRenderedPageBreak/>
         <w:t>Must-have Points</w:t>
       </w:r>
     </w:p>
@@ -9364,17 +9058,7 @@
           <w:sz w:val="28"/>
           <w:szCs w:val="28"/>
         </w:rPr>
-        <w:t xml:space="preserve">. </w:t>
-      </w:r>
-      <w:r>
-        <w:rPr>
-          <w:rFonts w:ascii="Trebuchet MS" w:hAnsi="Trebuchet MS"/>
-          <w:color w:val="212121"/>
-          <w:sz w:val="28"/>
-          <w:szCs w:val="28"/>
-        </w:rPr>
-        <w:lastRenderedPageBreak/>
-        <w:t>(Source: HUMA2635_10.pdf, p.6)</w:t>
+        <w:t>. (Source: HUMA2635_10.pdf, p.6)</w:t>
       </w:r>
     </w:p>
     <w:p>
@@ -9403,7 +9087,6 @@
         </w:rPr>
         <w:t>This </w:t>
       </w:r>
-      <w:proofErr w:type="spellStart"/>
       <w:r>
         <w:rPr>
           <w:rFonts w:ascii="Trebuchet MS" w:hAnsi="Trebuchet MS"/>
@@ -9413,19 +9096,7 @@
           <w:sz w:val="28"/>
           <w:szCs w:val="28"/>
         </w:rPr>
-        <w:t>Lamaist</w:t>
-      </w:r>
-      <w:proofErr w:type="spellEnd"/>
-      <w:r>
-        <w:rPr>
-          <w:rFonts w:ascii="Trebuchet MS" w:hAnsi="Trebuchet MS"/>
-          <w:b/>
-          <w:bCs/>
-          <w:color w:val="212121"/>
-          <w:sz w:val="28"/>
-          <w:szCs w:val="28"/>
-        </w:rPr>
-        <w:t xml:space="preserve"> hierarchy</w:t>
+        <w:t>Lamaist hierarchy</w:t>
       </w:r>
       <w:r>
         <w:rPr>
@@ -9655,7 +9326,6 @@
         </w:rPr>
         <w:t>Tibetan Buddhism was not a monolithic entity: the </w:t>
       </w:r>
-      <w:proofErr w:type="spellStart"/>
       <w:r>
         <w:rPr>
           <w:rFonts w:ascii="Trebuchet MS" w:hAnsi="Trebuchet MS"/>
@@ -9665,19 +9335,7 @@
           <w:sz w:val="28"/>
           <w:szCs w:val="28"/>
         </w:rPr>
-        <w:t>Kangba</w:t>
-      </w:r>
-      <w:proofErr w:type="spellEnd"/>
-      <w:r>
-        <w:rPr>
-          <w:rFonts w:ascii="Trebuchet MS" w:hAnsi="Trebuchet MS"/>
-          <w:b/>
-          <w:bCs/>
-          <w:color w:val="212121"/>
-          <w:sz w:val="28"/>
-          <w:szCs w:val="28"/>
-        </w:rPr>
-        <w:t xml:space="preserve"> (</w:t>
+        <w:t>Kangba (</w:t>
       </w:r>
       <w:r>
         <w:rPr>
@@ -9775,6 +9433,7 @@
           <w:sz w:val="28"/>
           <w:szCs w:val="28"/>
         </w:rPr>
+        <w:lastRenderedPageBreak/>
         <w:t>Tea and butter</w:t>
       </w:r>
       <w:r>
@@ -9784,17 +9443,7 @@
           <w:sz w:val="28"/>
           <w:szCs w:val="28"/>
         </w:rPr>
-        <w:t xml:space="preserve"> were staples linked to Buddhist culture; tea compressed into bricks came from inland China, and buttered tea was believed to warm the body, fight hunger, and aid digestion — a cultural tie between Tibet and the </w:t>
-      </w:r>
-      <w:r>
-        <w:rPr>
-          <w:rFonts w:ascii="Trebuchet MS" w:hAnsi="Trebuchet MS"/>
-          <w:color w:val="212121"/>
-          <w:sz w:val="28"/>
-          <w:szCs w:val="28"/>
-        </w:rPr>
-        <w:lastRenderedPageBreak/>
-        <w:t>rest of China since the 7th century. (Source: HUMA2635_10.pdf, p.16)</w:t>
+        <w:t> were staples linked to Buddhist culture; tea compressed into bricks came from inland China, and buttered tea was believed to warm the body, fight hunger, and aid digestion — a cultural tie between Tibet and the rest of China since the 7th century. (Source: HUMA2635_10.pdf, p.16)</w:t>
       </w:r>
     </w:p>
     <w:p>
@@ -10016,7 +9665,6 @@
         </w:rPr>
         <w:t>The Kuomintang government created the province of </w:t>
       </w:r>
-      <w:proofErr w:type="spellStart"/>
       <w:r>
         <w:rPr>
           <w:rFonts w:ascii="Trebuchet MS" w:hAnsi="Trebuchet MS"/>
@@ -10026,19 +9674,7 @@
           <w:sz w:val="28"/>
           <w:szCs w:val="28"/>
         </w:rPr>
-        <w:t>Xikang</w:t>
-      </w:r>
-      <w:proofErr w:type="spellEnd"/>
-      <w:r>
-        <w:rPr>
-          <w:rFonts w:ascii="Trebuchet MS" w:hAnsi="Trebuchet MS"/>
-          <w:b/>
-          <w:bCs/>
-          <w:color w:val="212121"/>
-          <w:sz w:val="28"/>
-          <w:szCs w:val="28"/>
-        </w:rPr>
-        <w:t xml:space="preserve"> (</w:t>
+        <w:t>Xikang (</w:t>
       </w:r>
       <w:r>
         <w:rPr>
@@ -10147,6 +9783,7 @@
           <w:sz w:val="28"/>
           <w:szCs w:val="28"/>
         </w:rPr>
+        <w:lastRenderedPageBreak/>
         <w:t>After 1949, a system of </w:t>
       </w:r>
       <w:r>
@@ -10187,19 +9824,19 @@
           <w:sz w:val="28"/>
           <w:szCs w:val="28"/>
         </w:rPr>
-        <w:t xml:space="preserve"> and marched to </w:t>
-      </w:r>
-      <w:proofErr w:type="spellStart"/>
-      <w:r>
-        <w:rPr>
-          <w:rFonts w:ascii="Trebuchet MS" w:hAnsi="Trebuchet MS"/>
+        <w:t> and marched to Changdu. In </w:t>
+      </w:r>
+      <w:r>
+        <w:rPr>
+          <w:rFonts w:ascii="Trebuchet MS" w:hAnsi="Trebuchet MS"/>
+          <w:b/>
+          <w:bCs/>
           <w:color w:val="212121"/>
           <w:sz w:val="28"/>
           <w:szCs w:val="28"/>
         </w:rPr>
-        <w:t>Changdu</w:t>
-      </w:r>
-      <w:proofErr w:type="spellEnd"/>
+        <w:t>1951, the Seventeen Point Agreement</w:t>
+      </w:r>
       <w:r>
         <w:rPr>
           <w:rFonts w:ascii="Trebuchet MS" w:hAnsi="Trebuchet MS"/>
@@ -10207,37 +9844,7 @@
           <w:sz w:val="28"/>
           <w:szCs w:val="28"/>
         </w:rPr>
-        <w:t>. In </w:t>
-      </w:r>
-      <w:r>
-        <w:rPr>
-          <w:rFonts w:ascii="Trebuchet MS" w:hAnsi="Trebuchet MS"/>
-          <w:b/>
-          <w:bCs/>
-          <w:color w:val="212121"/>
-          <w:sz w:val="28"/>
-          <w:szCs w:val="28"/>
-        </w:rPr>
-        <w:t>1951, the Seventeen Point Agreement</w:t>
-      </w:r>
-      <w:r>
-        <w:rPr>
-          <w:rFonts w:ascii="Trebuchet MS" w:hAnsi="Trebuchet MS"/>
-          <w:color w:val="212121"/>
-          <w:sz w:val="28"/>
-          <w:szCs w:val="28"/>
-        </w:rPr>
-        <w:t xml:space="preserve"> was signed: the PLA would </w:t>
-      </w:r>
-      <w:r>
-        <w:rPr>
-          <w:rFonts w:ascii="Trebuchet MS" w:hAnsi="Trebuchet MS"/>
-          <w:color w:val="212121"/>
-          <w:sz w:val="28"/>
-          <w:szCs w:val="28"/>
-        </w:rPr>
-        <w:lastRenderedPageBreak/>
-        <w:t>enter Tibet to consolidate national defense, and the Tibetan army would be integrated into the PLA. (Source: HUMA2635_6.pdf, p.19)</w:t>
+        <w:t> was signed: the PLA would enter Tibet to consolidate national defense, and the Tibetan army would be integrated into the PLA. (Source: HUMA2635_6.pdf, p.19)</w:t>
       </w:r>
     </w:p>
     <w:p>
@@ -10435,7 +10042,19 @@
           <w:sz w:val="28"/>
           <w:szCs w:val="28"/>
         </w:rPr>
-        <w:t>Paragraph 3: Developments in Tibetan Buddhism under Changing Regimes</w:t>
+        <w:t xml:space="preserve">Paragraph 3: Developments in Tibetan Buddhism under </w:t>
+      </w:r>
+      <w:r>
+        <w:rPr>
+          <w:rFonts w:ascii="Trebuchet MS" w:hAnsi="Trebuchet MS"/>
+          <w:b/>
+          <w:bCs/>
+          <w:color w:val="212121"/>
+          <w:sz w:val="28"/>
+          <w:szCs w:val="28"/>
+        </w:rPr>
+        <w:lastRenderedPageBreak/>
+        <w:t>Changing Regimes</w:t>
       </w:r>
     </w:p>
     <w:p>
@@ -10487,17 +10106,7 @@
           <w:sz w:val="28"/>
           <w:szCs w:val="28"/>
         </w:rPr>
-        <w:t xml:space="preserve">Reincarnation politics were often manipulated by powerful families. Qing reforms required the Dalai Lama to be </w:t>
-      </w:r>
-      <w:r>
-        <w:rPr>
-          <w:rFonts w:ascii="Trebuchet MS" w:hAnsi="Trebuchet MS"/>
-          <w:color w:val="212121"/>
-          <w:sz w:val="28"/>
-          <w:szCs w:val="28"/>
-        </w:rPr>
-        <w:lastRenderedPageBreak/>
-        <w:t>reincarnated in a </w:t>
+        <w:t>Reincarnation politics were often manipulated by powerful families. Qing reforms required the Dalai Lama to be reincarnated in a </w:t>
       </w:r>
       <w:r>
         <w:rPr>
@@ -10778,6 +10387,7 @@
           <w:sz w:val="28"/>
           <w:szCs w:val="28"/>
         </w:rPr>
+        <w:lastRenderedPageBreak/>
         <w:t>Bonus Points</w:t>
       </w:r>
     </w:p>
@@ -10825,17 +10435,7 @@
           <w:sz w:val="28"/>
           <w:szCs w:val="28"/>
         </w:rPr>
-        <w:t xml:space="preserve">: small PLA work teams won trust by dispensing seeds, tools, and learning local languages, while </w:t>
-      </w:r>
-      <w:r>
-        <w:rPr>
-          <w:rFonts w:ascii="Trebuchet MS" w:hAnsi="Trebuchet MS"/>
-          <w:color w:val="212121"/>
-          <w:sz w:val="28"/>
-          <w:szCs w:val="28"/>
-        </w:rPr>
-        <w:lastRenderedPageBreak/>
-        <w:t>propagandizing party doctrine and nationalities policy — a soft approach that gradually transformed the religious-political landscape. (Source: HUMA2635_6.pdf, p.24)</w:t>
+        <w:t>: small PLA work teams won trust by dispensing seeds, tools, and learning local languages, while propagandizing party doctrine and nationalities policy — a soft approach that gradually transformed the religious-political landscape. (Source: HUMA2635_6.pdf, p.24)</w:t>
       </w:r>
     </w:p>
     <w:p>
@@ -10946,7 +10546,7 @@
           <w:sz w:val="28"/>
           <w:szCs w:val="28"/>
         </w:rPr>
-        <w:t xml:space="preserve">Tibet's traditional society was a theocracy in which the Dalai Lama held both temporal and spiritual authority. The reincarnation system, established in 1447 during the Ming dynasty, was supported by the Qing court through the Court of Colonial Affairs and supervised by the resident amban (HUMA2635_10, p.6). The Dalai Lama was revered as the reincarnation of Avalokitesvara, while the Panchen Lama was proclaimed the reincarnation of Amitabha. Although Amitabha ranked higher spiritually, the Panchen Lama's temporal powers were minimal compared to the Dalai Lama's (HUMA2635_10, p.9). This dual religious leadership coexisted with a semi-feudal social </w:t>
+        <w:t xml:space="preserve">Tibet's traditional society was a theocracy in which the Dalai Lama held both temporal and spiritual authority. The reincarnation system, established in 1447 during the Ming dynasty, was supported by the Qing court through the Court of Colonial Affairs and supervised by the resident amban (HUMA2635_10, p.6). The Dalai Lama was revered as the reincarnation of Avalokitesvara, while the Panchen Lama was </w:t>
       </w:r>
       <w:r>
         <w:rPr>
@@ -10956,7 +10556,7 @@
           <w:szCs w:val="28"/>
         </w:rPr>
         <w:lastRenderedPageBreak/>
-        <w:t>structure dominated by noble families and monasteries.</w:t>
+        <w:t>proclaimed the reincarnation of Amitabha. Although Amitabha ranked higher spiritually, the Panchen Lama's temporal powers were minimal compared to the Dalai Lama's (HUMA2635_10, p.9). This dual religious leadership coexisted with a semi-feudal social structure dominated by noble families and monasteries.</w:t>
       </w:r>
     </w:p>
     <w:p>
@@ -10979,19 +10579,22 @@
           <w:sz w:val="28"/>
           <w:szCs w:val="28"/>
         </w:rPr>
-        <w:t xml:space="preserve">Major social changes began in the early twentieth century. The 1911 revolution allowed Tibetans to expel Qing troops, and the 1914 Simla Conference attempted to redefine Tibet's status, though republican China refused to ratify the agreement (HUMA2635_5, p.48). The Kuomintang established </w:t>
-      </w:r>
-      <w:proofErr w:type="spellStart"/>
-      <w:r>
+        <w:t>Major social changes began in the early twentieth century. The 1911 revolution allowed Tibetans to expel Qing troops, and the 1914 Simla Conference attempted to redefine Tibet's status, though republican China refused to ratify the agreement (HUMA2635_5, p.48). The Kuomintang established Xikang Province in 1939, and the 14th Dalai Lama was inaugurated in 1940. The decisive transformation came after 1949: in 1951, the Seventeen Point Agreement brought Tibet under the new socialist state, with the PLA entering to consolidate national defense and the Tibetan army integrated into the PLA (HUMA2635_6, p.19). Democratic reforms dismantled the old feudal-theocratic order, party structures replaced traditional authorities, and a regional autonomy framework was gradually implemented.</w:t>
+      </w:r>
+    </w:p>
+    <w:p>
+      <w:pPr>
+        <w:tabs>
+          <w:tab w:val="left" w:pos="3044"/>
+        </w:tabs>
+        <w:jc w:val="left"/>
         <w:rPr>
           <w:rFonts w:ascii="Trebuchet MS" w:hAnsi="Trebuchet MS"/>
           <w:color w:val="212121"/>
           <w:sz w:val="28"/>
           <w:szCs w:val="28"/>
         </w:rPr>
-        <w:t>Xikang</w:t>
-      </w:r>
-      <w:proofErr w:type="spellEnd"/>
+      </w:pPr>
       <w:r>
         <w:rPr>
           <w:rFonts w:ascii="Trebuchet MS" w:hAnsi="Trebuchet MS"/>
@@ -10999,7 +10602,17 @@
           <w:sz w:val="28"/>
           <w:szCs w:val="28"/>
         </w:rPr>
-        <w:t xml:space="preserve"> Province in 1939, and the 14th Dalai Lama was inaugurated in 1940. The decisive transformation came after 1949: in 1951, the Seventeen Point Agreement brought Tibet under the new socialist state, with the PLA entering to consolidate national defense and the Tibetan army integrated into the PLA (HUMA2635_6, p.19). Democratic reforms dismantled the old feudal-theocratic order, party structures replaced traditional authorities, and a regional autonomy framework was gradually implemented.</w:t>
+        <w:t xml:space="preserve">Buddhism itself evolved amid these political shifts. Qing reforms had already required the Dalai Lama to be reincarnated in a commoner’s family, bureaucratizing Tibetan administration and strengthening the Dalai Lama’s position against the nobility </w:t>
+      </w:r>
+      <w:r>
+        <w:rPr>
+          <w:rFonts w:ascii="Trebuchet MS" w:hAnsi="Trebuchet MS"/>
+          <w:color w:val="212121"/>
+          <w:sz w:val="28"/>
+          <w:szCs w:val="28"/>
+        </w:rPr>
+        <w:lastRenderedPageBreak/>
+        <w:t>(HUMA2635_10, p.7). The 13th Dalai Lama forged an alliance with Britain, prompting the 9th Panchen Lama to seek Chinese central government support, illustrating how religious authority became entangled with geopolitical rivalries (HUMA2635_10, p.9). Under the People’s Republic, the party line guaranteed freedom of religion and respect for customs, while “patriotic upper strata” were co-opted and both Han chauvinism and local nationalism were officially opposed (HUMA2635_6, pp.16,22). Thus, Tibetan Buddhism moved from being the ideological foundation of a theocracy to a religion operating within a socialist state that promised autonomy but demanded political loyalty — a tension that continues to define Tibet’s social and spiritual life.</w:t>
       </w:r>
     </w:p>
     <w:p>
@@ -11010,39 +10623,6 @@
         <w:jc w:val="left"/>
         <w:rPr>
           <w:rFonts w:ascii="Trebuchet MS" w:hAnsi="Trebuchet MS"/>
-          <w:color w:val="212121"/>
-          <w:sz w:val="28"/>
-          <w:szCs w:val="28"/>
-        </w:rPr>
-      </w:pPr>
-      <w:r>
-        <w:rPr>
-          <w:rFonts w:ascii="Trebuchet MS" w:hAnsi="Trebuchet MS"/>
-          <w:color w:val="212121"/>
-          <w:sz w:val="28"/>
-          <w:szCs w:val="28"/>
-        </w:rPr>
-        <w:t xml:space="preserve">Buddhism itself evolved amid these political shifts. Qing reforms had already required the Dalai Lama to be reincarnated in a commoner’s family, bureaucratizing Tibetan administration and strengthening the Dalai Lama’s position against the nobility (HUMA2635_10, p.7). The 13th Dalai Lama forged an alliance with Britain, prompting the 9th Panchen Lama to seek Chinese central government support, illustrating how religious authority became entangled with geopolitical rivalries (HUMA2635_10, p.9). Under </w:t>
-      </w:r>
-      <w:r>
-        <w:rPr>
-          <w:rFonts w:ascii="Trebuchet MS" w:hAnsi="Trebuchet MS"/>
-          <w:color w:val="212121"/>
-          <w:sz w:val="28"/>
-          <w:szCs w:val="28"/>
-        </w:rPr>
-        <w:lastRenderedPageBreak/>
-        <w:t>the People’s Republic, the party line guaranteed freedom of religion and respect for customs, while “patriotic upper strata” were co-opted and both Han chauvinism and local nationalism were officially opposed (HUMA2635_6, pp.16,22). Thus, Tibetan Buddhism moved from being the ideological foundation of a theocracy to a religion operating within a socialist state that promised autonomy but demanded political loyalty — a tension that continues to define Tibet’s social and spiritual life.</w:t>
-      </w:r>
-    </w:p>
-    <w:p>
-      <w:pPr>
-        <w:tabs>
-          <w:tab w:val="left" w:pos="3044"/>
-        </w:tabs>
-        <w:jc w:val="left"/>
-        <w:rPr>
-          <w:rFonts w:ascii="Trebuchet MS" w:hAnsi="Trebuchet MS" w:hint="eastAsia"/>
           <w:b/>
           <w:bCs/>
           <w:color w:val="212121"/>

</xml_diff>